<commit_message>
doc: update documents , changed mindmap or agenticflow to mind-flow
</commit_message>
<xml_diff>
--- a/Documentation/project_report.docx
+++ b/Documentation/project_report.docx
@@ -11,11 +11,8 @@
       <w:bookmarkStart w:id="0" w:name="Xf9f4e726d0013724d2e6d75d91d35965e2f0fc5"/>
       <w:bookmarkStart w:id="1" w:name="conclusion"/>
       <w:r>
-        <w:rPr>
-          <w:noProof/>
-        </w:rPr>
         <w:drawing>
-          <wp:inline distT="0" distB="0" distL="0" distR="0" wp14:anchorId="744E01F7" wp14:editId="46222C54">
+          <wp:inline distT="0" distB="0" distL="0" distR="0" wp14:anchorId="744E01F7" wp14:editId="5BD987C6">
             <wp:extent cx="2110740" cy="823172"/>
             <wp:effectExtent l="0" t="0" r="0" b="0"/>
             <wp:docPr id="1370940288" name="Picture 1"/>
@@ -127,7 +124,13 @@
         <w:pStyle w:val="Title"/>
       </w:pPr>
       <w:r>
-        <w:t>Case 21: Mind Map -</w:t>
+        <w:t xml:space="preserve">Case 21: Mind </w:t>
+      </w:r>
+      <w:r>
+        <w:t>Flow</w:t>
+      </w:r>
+      <w:r>
+        <w:t xml:space="preserve"> -</w:t>
       </w:r>
       <w:r>
         <w:rPr>
@@ -257,7 +260,7 @@
           <w:r>
             <w:fldChar w:fldCharType="separate"/>
           </w:r>
-          <w:hyperlink w:anchor="_Toc225245354" w:history="1">
+          <w:hyperlink w:anchor="_Toc225263330" w:history="1">
             <w:r>
               <w:rPr>
                 <w:rStyle w:val="Hyperlink"/>
@@ -284,7 +287,7 @@
                 <w:noProof/>
                 <w:webHidden/>
               </w:rPr>
-              <w:instrText xml:space="preserve"> PAGEREF _Toc225245354 \h </w:instrText>
+              <w:instrText xml:space="preserve"> PAGEREF _Toc225263330 \h </w:instrText>
             </w:r>
             <w:r>
               <w:rPr>
@@ -329,7 +332,7 @@
               <w14:ligatures w14:val="standardContextual"/>
             </w:rPr>
           </w:pPr>
-          <w:hyperlink w:anchor="_Toc225245355" w:history="1">
+          <w:hyperlink w:anchor="_Toc225263331" w:history="1">
             <w:r>
               <w:rPr>
                 <w:rStyle w:val="Hyperlink"/>
@@ -356,7 +359,7 @@
                 <w:noProof/>
                 <w:webHidden/>
               </w:rPr>
-              <w:instrText xml:space="preserve"> PAGEREF _Toc225245355 \h </w:instrText>
+              <w:instrText xml:space="preserve"> PAGEREF _Toc225263331 \h </w:instrText>
             </w:r>
             <w:r>
               <w:rPr>
@@ -401,7 +404,7 @@
               <w14:ligatures w14:val="standardContextual"/>
             </w:rPr>
           </w:pPr>
-          <w:hyperlink w:anchor="_Toc225245356" w:history="1">
+          <w:hyperlink w:anchor="_Toc225263332" w:history="1">
             <w:r>
               <w:rPr>
                 <w:rStyle w:val="Hyperlink"/>
@@ -428,7 +431,7 @@
                 <w:noProof/>
                 <w:webHidden/>
               </w:rPr>
-              <w:instrText xml:space="preserve"> PAGEREF _Toc225245356 \h </w:instrText>
+              <w:instrText xml:space="preserve"> PAGEREF _Toc225263332 \h </w:instrText>
             </w:r>
             <w:r>
               <w:rPr>
@@ -473,7 +476,7 @@
               <w14:ligatures w14:val="standardContextual"/>
             </w:rPr>
           </w:pPr>
-          <w:hyperlink w:anchor="_Toc225245357" w:history="1">
+          <w:hyperlink w:anchor="_Toc225263333" w:history="1">
             <w:r>
               <w:rPr>
                 <w:rStyle w:val="Hyperlink"/>
@@ -500,7 +503,7 @@
                 <w:noProof/>
                 <w:webHidden/>
               </w:rPr>
-              <w:instrText xml:space="preserve"> PAGEREF _Toc225245357 \h </w:instrText>
+              <w:instrText xml:space="preserve"> PAGEREF _Toc225263333 \h </w:instrText>
             </w:r>
             <w:r>
               <w:rPr>
@@ -545,7 +548,7 @@
               <w14:ligatures w14:val="standardContextual"/>
             </w:rPr>
           </w:pPr>
-          <w:hyperlink w:anchor="_Toc225245358" w:history="1">
+          <w:hyperlink w:anchor="_Toc225263334" w:history="1">
             <w:r>
               <w:rPr>
                 <w:rStyle w:val="Hyperlink"/>
@@ -572,7 +575,7 @@
                 <w:noProof/>
                 <w:webHidden/>
               </w:rPr>
-              <w:instrText xml:space="preserve"> PAGEREF _Toc225245358 \h </w:instrText>
+              <w:instrText xml:space="preserve"> PAGEREF _Toc225263334 \h </w:instrText>
             </w:r>
             <w:r>
               <w:rPr>
@@ -617,7 +620,7 @@
               <w14:ligatures w14:val="standardContextual"/>
             </w:rPr>
           </w:pPr>
-          <w:hyperlink w:anchor="_Toc225245359" w:history="1">
+          <w:hyperlink w:anchor="_Toc225263335" w:history="1">
             <w:r>
               <w:rPr>
                 <w:rStyle w:val="Hyperlink"/>
@@ -644,7 +647,7 @@
                 <w:noProof/>
                 <w:webHidden/>
               </w:rPr>
-              <w:instrText xml:space="preserve"> PAGEREF _Toc225245359 \h </w:instrText>
+              <w:instrText xml:space="preserve"> PAGEREF _Toc225263335 \h </w:instrText>
             </w:r>
             <w:r>
               <w:rPr>
@@ -689,7 +692,7 @@
               <w14:ligatures w14:val="standardContextual"/>
             </w:rPr>
           </w:pPr>
-          <w:hyperlink w:anchor="_Toc225245360" w:history="1">
+          <w:hyperlink w:anchor="_Toc225263336" w:history="1">
             <w:r>
               <w:rPr>
                 <w:rStyle w:val="Hyperlink"/>
@@ -716,7 +719,7 @@
                 <w:noProof/>
                 <w:webHidden/>
               </w:rPr>
-              <w:instrText xml:space="preserve"> PAGEREF _Toc225245360 \h </w:instrText>
+              <w:instrText xml:space="preserve"> PAGEREF _Toc225263336 \h </w:instrText>
             </w:r>
             <w:r>
               <w:rPr>
@@ -761,7 +764,7 @@
               <w14:ligatures w14:val="standardContextual"/>
             </w:rPr>
           </w:pPr>
-          <w:hyperlink w:anchor="_Toc225245361" w:history="1">
+          <w:hyperlink w:anchor="_Toc225263337" w:history="1">
             <w:r>
               <w:rPr>
                 <w:rStyle w:val="Hyperlink"/>
@@ -788,7 +791,7 @@
                 <w:noProof/>
                 <w:webHidden/>
               </w:rPr>
-              <w:instrText xml:space="preserve"> PAGEREF _Toc225245361 \h </w:instrText>
+              <w:instrText xml:space="preserve"> PAGEREF _Toc225263337 \h </w:instrText>
             </w:r>
             <w:r>
               <w:rPr>
@@ -833,7 +836,7 @@
               <w14:ligatures w14:val="standardContextual"/>
             </w:rPr>
           </w:pPr>
-          <w:hyperlink w:anchor="_Toc225245362" w:history="1">
+          <w:hyperlink w:anchor="_Toc225263338" w:history="1">
             <w:r>
               <w:rPr>
                 <w:rStyle w:val="Hyperlink"/>
@@ -860,7 +863,7 @@
                 <w:noProof/>
                 <w:webHidden/>
               </w:rPr>
-              <w:instrText xml:space="preserve"> PAGEREF _Toc225245362 \h </w:instrText>
+              <w:instrText xml:space="preserve"> PAGEREF _Toc225263338 \h </w:instrText>
             </w:r>
             <w:r>
               <w:rPr>
@@ -905,7 +908,7 @@
               <w14:ligatures w14:val="standardContextual"/>
             </w:rPr>
           </w:pPr>
-          <w:hyperlink w:anchor="_Toc225245363" w:history="1">
+          <w:hyperlink w:anchor="_Toc225263339" w:history="1">
             <w:r>
               <w:rPr>
                 <w:rStyle w:val="Hyperlink"/>
@@ -932,7 +935,7 @@
                 <w:noProof/>
                 <w:webHidden/>
               </w:rPr>
-              <w:instrText xml:space="preserve"> PAGEREF _Toc225245363 \h </w:instrText>
+              <w:instrText xml:space="preserve"> PAGEREF _Toc225263339 \h </w:instrText>
             </w:r>
             <w:r>
               <w:rPr>
@@ -977,7 +980,7 @@
               <w14:ligatures w14:val="standardContextual"/>
             </w:rPr>
           </w:pPr>
-          <w:hyperlink w:anchor="_Toc225245364" w:history="1">
+          <w:hyperlink w:anchor="_Toc225263340" w:history="1">
             <w:r>
               <w:rPr>
                 <w:rStyle w:val="Hyperlink"/>
@@ -1004,7 +1007,7 @@
                 <w:noProof/>
                 <w:webHidden/>
               </w:rPr>
-              <w:instrText xml:space="preserve"> PAGEREF _Toc225245364 \h </w:instrText>
+              <w:instrText xml:space="preserve"> PAGEREF _Toc225263340 \h </w:instrText>
             </w:r>
             <w:r>
               <w:rPr>
@@ -1049,7 +1052,7 @@
               <w14:ligatures w14:val="standardContextual"/>
             </w:rPr>
           </w:pPr>
-          <w:hyperlink w:anchor="_Toc225245365" w:history="1">
+          <w:hyperlink w:anchor="_Toc225263341" w:history="1">
             <w:r>
               <w:rPr>
                 <w:rStyle w:val="Hyperlink"/>
@@ -1076,7 +1079,7 @@
                 <w:noProof/>
                 <w:webHidden/>
               </w:rPr>
-              <w:instrText xml:space="preserve"> PAGEREF _Toc225245365 \h </w:instrText>
+              <w:instrText xml:space="preserve"> PAGEREF _Toc225263341 \h </w:instrText>
             </w:r>
             <w:r>
               <w:rPr>
@@ -1121,7 +1124,7 @@
               <w14:ligatures w14:val="standardContextual"/>
             </w:rPr>
           </w:pPr>
-          <w:hyperlink w:anchor="_Toc225245366" w:history="1">
+          <w:hyperlink w:anchor="_Toc225263342" w:history="1">
             <w:r>
               <w:rPr>
                 <w:rStyle w:val="Hyperlink"/>
@@ -1148,7 +1151,7 @@
                 <w:noProof/>
                 <w:webHidden/>
               </w:rPr>
-              <w:instrText xml:space="preserve"> PAGEREF _Toc225245366 \h </w:instrText>
+              <w:instrText xml:space="preserve"> PAGEREF _Toc225263342 \h </w:instrText>
             </w:r>
             <w:r>
               <w:rPr>
@@ -1193,7 +1196,7 @@
               <w14:ligatures w14:val="standardContextual"/>
             </w:rPr>
           </w:pPr>
-          <w:hyperlink w:anchor="_Toc225245367" w:history="1">
+          <w:hyperlink w:anchor="_Toc225263343" w:history="1">
             <w:r>
               <w:rPr>
                 <w:rStyle w:val="Hyperlink"/>
@@ -1220,7 +1223,7 @@
                 <w:noProof/>
                 <w:webHidden/>
               </w:rPr>
-              <w:instrText xml:space="preserve"> PAGEREF _Toc225245367 \h </w:instrText>
+              <w:instrText xml:space="preserve"> PAGEREF _Toc225263343 \h </w:instrText>
             </w:r>
             <w:r>
               <w:rPr>
@@ -1265,7 +1268,7 @@
               <w14:ligatures w14:val="standardContextual"/>
             </w:rPr>
           </w:pPr>
-          <w:hyperlink w:anchor="_Toc225245368" w:history="1">
+          <w:hyperlink w:anchor="_Toc225263344" w:history="1">
             <w:r>
               <w:rPr>
                 <w:rStyle w:val="Hyperlink"/>
@@ -1292,7 +1295,7 @@
                 <w:noProof/>
                 <w:webHidden/>
               </w:rPr>
-              <w:instrText xml:space="preserve"> PAGEREF _Toc225245368 \h </w:instrText>
+              <w:instrText xml:space="preserve"> PAGEREF _Toc225263344 \h </w:instrText>
             </w:r>
             <w:r>
               <w:rPr>
@@ -1337,7 +1340,7 @@
               <w14:ligatures w14:val="standardContextual"/>
             </w:rPr>
           </w:pPr>
-          <w:hyperlink w:anchor="_Toc225245369" w:history="1">
+          <w:hyperlink w:anchor="_Toc225263345" w:history="1">
             <w:r>
               <w:rPr>
                 <w:rStyle w:val="Hyperlink"/>
@@ -1364,7 +1367,7 @@
                 <w:noProof/>
                 <w:webHidden/>
               </w:rPr>
-              <w:instrText xml:space="preserve"> PAGEREF _Toc225245369 \h </w:instrText>
+              <w:instrText xml:space="preserve"> PAGEREF _Toc225263345 \h </w:instrText>
             </w:r>
             <w:r>
               <w:rPr>
@@ -1409,7 +1412,7 @@
               <w14:ligatures w14:val="standardContextual"/>
             </w:rPr>
           </w:pPr>
-          <w:hyperlink w:anchor="_Toc225245370" w:history="1">
+          <w:hyperlink w:anchor="_Toc225263346" w:history="1">
             <w:r>
               <w:rPr>
                 <w:rStyle w:val="Hyperlink"/>
@@ -1436,7 +1439,7 @@
                 <w:noProof/>
                 <w:webHidden/>
               </w:rPr>
-              <w:instrText xml:space="preserve"> PAGEREF _Toc225245370 \h </w:instrText>
+              <w:instrText xml:space="preserve"> PAGEREF _Toc225263346 \h </w:instrText>
             </w:r>
             <w:r>
               <w:rPr>
@@ -1481,7 +1484,7 @@
               <w14:ligatures w14:val="standardContextual"/>
             </w:rPr>
           </w:pPr>
-          <w:hyperlink w:anchor="_Toc225245371" w:history="1">
+          <w:hyperlink w:anchor="_Toc225263347" w:history="1">
             <w:r>
               <w:rPr>
                 <w:rStyle w:val="Hyperlink"/>
@@ -1508,7 +1511,7 @@
                 <w:noProof/>
                 <w:webHidden/>
               </w:rPr>
-              <w:instrText xml:space="preserve"> PAGEREF _Toc225245371 \h </w:instrText>
+              <w:instrText xml:space="preserve"> PAGEREF _Toc225263347 \h </w:instrText>
             </w:r>
             <w:r>
               <w:rPr>
@@ -1553,7 +1556,7 @@
               <w14:ligatures w14:val="standardContextual"/>
             </w:rPr>
           </w:pPr>
-          <w:hyperlink w:anchor="_Toc225245372" w:history="1">
+          <w:hyperlink w:anchor="_Toc225263348" w:history="1">
             <w:r>
               <w:rPr>
                 <w:rStyle w:val="Hyperlink"/>
@@ -1580,7 +1583,7 @@
                 <w:noProof/>
                 <w:webHidden/>
               </w:rPr>
-              <w:instrText xml:space="preserve"> PAGEREF _Toc225245372 \h </w:instrText>
+              <w:instrText xml:space="preserve"> PAGEREF _Toc225263348 \h </w:instrText>
             </w:r>
             <w:r>
               <w:rPr>
@@ -1625,7 +1628,7 @@
               <w14:ligatures w14:val="standardContextual"/>
             </w:rPr>
           </w:pPr>
-          <w:hyperlink w:anchor="_Toc225245373" w:history="1">
+          <w:hyperlink w:anchor="_Toc225263349" w:history="1">
             <w:r>
               <w:rPr>
                 <w:rStyle w:val="Hyperlink"/>
@@ -1652,7 +1655,7 @@
                 <w:noProof/>
                 <w:webHidden/>
               </w:rPr>
-              <w:instrText xml:space="preserve"> PAGEREF _Toc225245373 \h </w:instrText>
+              <w:instrText xml:space="preserve"> PAGEREF _Toc225263349 \h </w:instrText>
             </w:r>
             <w:r>
               <w:rPr>
@@ -1697,7 +1700,7 @@
               <w14:ligatures w14:val="standardContextual"/>
             </w:rPr>
           </w:pPr>
-          <w:hyperlink w:anchor="_Toc225245374" w:history="1">
+          <w:hyperlink w:anchor="_Toc225263350" w:history="1">
             <w:r>
               <w:rPr>
                 <w:rStyle w:val="Hyperlink"/>
@@ -1724,7 +1727,7 @@
                 <w:noProof/>
                 <w:webHidden/>
               </w:rPr>
-              <w:instrText xml:space="preserve"> PAGEREF _Toc225245374 \h </w:instrText>
+              <w:instrText xml:space="preserve"> PAGEREF _Toc225263350 \h </w:instrText>
             </w:r>
             <w:r>
               <w:rPr>
@@ -1769,7 +1772,7 @@
               <w14:ligatures w14:val="standardContextual"/>
             </w:rPr>
           </w:pPr>
-          <w:hyperlink w:anchor="_Toc225245375" w:history="1">
+          <w:hyperlink w:anchor="_Toc225263351" w:history="1">
             <w:r>
               <w:rPr>
                 <w:rStyle w:val="Hyperlink"/>
@@ -1796,7 +1799,7 @@
                 <w:noProof/>
                 <w:webHidden/>
               </w:rPr>
-              <w:instrText xml:space="preserve"> PAGEREF _Toc225245375 \h </w:instrText>
+              <w:instrText xml:space="preserve"> PAGEREF _Toc225263351 \h </w:instrText>
             </w:r>
             <w:r>
               <w:rPr>
@@ -1841,7 +1844,7 @@
               <w14:ligatures w14:val="standardContextual"/>
             </w:rPr>
           </w:pPr>
-          <w:hyperlink w:anchor="_Toc225245376" w:history="1">
+          <w:hyperlink w:anchor="_Toc225263352" w:history="1">
             <w:r>
               <w:rPr>
                 <w:rStyle w:val="Hyperlink"/>
@@ -1868,7 +1871,7 @@
                 <w:noProof/>
                 <w:webHidden/>
               </w:rPr>
-              <w:instrText xml:space="preserve"> PAGEREF _Toc225245376 \h </w:instrText>
+              <w:instrText xml:space="preserve"> PAGEREF _Toc225263352 \h </w:instrText>
             </w:r>
             <w:r>
               <w:rPr>
@@ -1913,7 +1916,7 @@
               <w14:ligatures w14:val="standardContextual"/>
             </w:rPr>
           </w:pPr>
-          <w:hyperlink w:anchor="_Toc225245377" w:history="1">
+          <w:hyperlink w:anchor="_Toc225263353" w:history="1">
             <w:r>
               <w:rPr>
                 <w:rStyle w:val="Hyperlink"/>
@@ -1940,7 +1943,7 @@
                 <w:noProof/>
                 <w:webHidden/>
               </w:rPr>
-              <w:instrText xml:space="preserve"> PAGEREF _Toc225245377 \h </w:instrText>
+              <w:instrText xml:space="preserve"> PAGEREF _Toc225263353 \h </w:instrText>
             </w:r>
             <w:r>
               <w:rPr>
@@ -1985,7 +1988,7 @@
               <w14:ligatures w14:val="standardContextual"/>
             </w:rPr>
           </w:pPr>
-          <w:hyperlink w:anchor="_Toc225245378" w:history="1">
+          <w:hyperlink w:anchor="_Toc225263354" w:history="1">
             <w:r>
               <w:rPr>
                 <w:rStyle w:val="Hyperlink"/>
@@ -2012,7 +2015,7 @@
                 <w:noProof/>
                 <w:webHidden/>
               </w:rPr>
-              <w:instrText xml:space="preserve"> PAGEREF _Toc225245378 \h </w:instrText>
+              <w:instrText xml:space="preserve"> PAGEREF _Toc225263354 \h </w:instrText>
             </w:r>
             <w:r>
               <w:rPr>
@@ -2032,7 +2035,7 @@
                 <w:noProof/>
                 <w:webHidden/>
               </w:rPr>
-              <w:t>11</w:t>
+              <w:t>12</w:t>
             </w:r>
             <w:r>
               <w:rPr>
@@ -2085,7 +2088,7 @@
       <w:pPr>
         <w:pStyle w:val="Heading1"/>
       </w:pPr>
-      <w:bookmarkStart w:id="2" w:name="_Toc225245354"/>
+      <w:bookmarkStart w:id="2" w:name="_Toc225263330"/>
       <w:r>
         <w:lastRenderedPageBreak/>
         <w:t>1. Project Overview</w:t>
@@ -2103,7 +2106,7 @@
       <w:pPr>
         <w:pStyle w:val="Heading2"/>
       </w:pPr>
-      <w:bookmarkStart w:id="3" w:name="_Toc225245355"/>
+      <w:bookmarkStart w:id="3" w:name="_Toc225263331"/>
       <w:r>
         <w:t>Summary of Objectives</w:t>
       </w:r>
@@ -2115,28 +2118,36 @@
           <w:rFonts w:ascii="Aptos" w:hAnsi="Aptos"/>
         </w:rPr>
       </w:pPr>
-      <w:proofErr w:type="spellStart"/>
-      <w:r>
-        <w:rPr>
-          <w:rFonts w:ascii="Aptos" w:hAnsi="Aptos"/>
-        </w:rPr>
-        <w:t>AgenticContentFlow</w:t>
-      </w:r>
-      <w:proofErr w:type="spellEnd"/>
+      <w:r>
+        <w:rPr>
+          <w:rFonts w:ascii="Aptos" w:hAnsi="Aptos"/>
+        </w:rPr>
+        <w:t>Mind-flow</w:t>
+      </w:r>
       <w:r>
         <w:rPr>
           <w:rFonts w:ascii="Aptos" w:hAnsi="Aptos"/>
         </w:rPr>
         <w:t xml:space="preserve"> is an advanced, full-stack educational platform designed to automate the evaluation of student-created concept flow graphs (</w:t>
       </w:r>
-      <w:proofErr w:type="spellStart"/>
-      <w:r>
-        <w:rPr>
-          <w:rFonts w:ascii="Aptos" w:hAnsi="Aptos"/>
-        </w:rPr>
-        <w:t>mindmaps</w:t>
-      </w:r>
-      <w:proofErr w:type="spellEnd"/>
+      <w:r>
+        <w:rPr>
+          <w:rFonts w:ascii="Aptos" w:hAnsi="Aptos"/>
+        </w:rPr>
+        <w:t>m</w:t>
+      </w:r>
+      <w:r>
+        <w:rPr>
+          <w:rFonts w:ascii="Aptos" w:hAnsi="Aptos"/>
+        </w:rPr>
+        <w:t>ind-flow</w:t>
+      </w:r>
+      <w:r>
+        <w:rPr>
+          <w:rFonts w:ascii="Aptos" w:hAnsi="Aptos"/>
+        </w:rPr>
+        <w:t>s</w:t>
+      </w:r>
       <w:r>
         <w:rPr>
           <w:rFonts w:ascii="Aptos" w:hAnsi="Aptos"/>
@@ -2155,7 +2166,7 @@
       <w:pPr>
         <w:pStyle w:val="Heading2"/>
       </w:pPr>
-      <w:bookmarkStart w:id="4" w:name="_Toc225245356"/>
+      <w:bookmarkStart w:id="4" w:name="_Toc225263332"/>
       <w:r>
         <w:t>Problem &amp; Solution</w:t>
       </w:r>
@@ -2165,7 +2176,7 @@
       <w:pPr>
         <w:pStyle w:val="Heading3"/>
       </w:pPr>
-      <w:bookmarkStart w:id="5" w:name="_Toc225245357"/>
+      <w:bookmarkStart w:id="5" w:name="_Toc225263333"/>
       <w:r>
         <w:t xml:space="preserve">Existing </w:t>
       </w:r>
@@ -2186,19 +2197,23 @@
         </w:rPr>
         <w:t xml:space="preserve">Traditional assessment of </w:t>
       </w:r>
-      <w:proofErr w:type="spellStart"/>
-      <w:r>
-        <w:rPr>
-          <w:rFonts w:ascii="Aptos" w:hAnsi="Aptos"/>
-        </w:rPr>
-        <w:t>mindmap</w:t>
-      </w:r>
-      <w:proofErr w:type="spellEnd"/>
-      <w:r>
-        <w:rPr>
-          <w:rFonts w:ascii="Aptos" w:hAnsi="Aptos"/>
-        </w:rPr>
-        <w:t xml:space="preserve"> is a manual, time-consuming process for educators. It is often subjective, lacks scalability, and provides slow feedback loops. For students, this means long </w:t>
+      <w:r>
+        <w:rPr>
+          <w:rFonts w:ascii="Aptos" w:hAnsi="Aptos"/>
+        </w:rPr>
+        <w:t>mind-flow</w:t>
+      </w:r>
+      <w:r>
+        <w:rPr>
+          <w:rFonts w:ascii="Aptos" w:hAnsi="Aptos"/>
+        </w:rPr>
+        <w:t xml:space="preserve"> </w:t>
+      </w:r>
+      <w:r>
+        <w:rPr>
+          <w:rFonts w:ascii="Aptos" w:hAnsi="Aptos"/>
+        </w:rPr>
+        <w:t xml:space="preserve">is a manual, time-consuming process for educators. It is often subjective, lacks scalability, and provides slow feedback loops. For students, this means long </w:t>
       </w:r>
       <w:r>
         <w:rPr>
@@ -2217,7 +2232,7 @@
       <w:pPr>
         <w:pStyle w:val="Heading3"/>
       </w:pPr>
-      <w:bookmarkStart w:id="6" w:name="_Toc225245358"/>
+      <w:bookmarkStart w:id="6" w:name="_Toc225263334"/>
       <w:r>
         <w:t xml:space="preserve">Possible </w:t>
       </w:r>
@@ -2235,19 +2250,23 @@
           <w:rFonts w:ascii="Aptos" w:hAnsi="Aptos"/>
         </w:rPr>
       </w:pPr>
-      <w:proofErr w:type="spellStart"/>
-      <w:r>
-        <w:rPr>
-          <w:rFonts w:ascii="Aptos" w:hAnsi="Aptos"/>
-        </w:rPr>
-        <w:t>Mindmap</w:t>
-      </w:r>
-      <w:proofErr w:type="spellEnd"/>
-      <w:r>
-        <w:rPr>
-          <w:rFonts w:ascii="Aptos" w:hAnsi="Aptos"/>
-        </w:rPr>
-        <w:t xml:space="preserve"> addresses this by providing an AI-driven, automated validation layer. By leveraging Large Language Models (LLMs) and Retrieval-Augmented Generation (RAG), the system:</w:t>
+      <w:r>
+        <w:rPr>
+          <w:rFonts w:ascii="Aptos" w:hAnsi="Aptos"/>
+        </w:rPr>
+        <w:t>M</w:t>
+      </w:r>
+      <w:r>
+        <w:rPr>
+          <w:rFonts w:ascii="Aptos" w:hAnsi="Aptos"/>
+        </w:rPr>
+        <w:t xml:space="preserve">ind-flow </w:t>
+      </w:r>
+      <w:r>
+        <w:rPr>
+          <w:rFonts w:ascii="Aptos" w:hAnsi="Aptos"/>
+        </w:rPr>
+        <w:t>addresses this by providing an AI-driven, automated validation layer. By leveraging Large Language Models (LLMs) and Retrieval-Augmented Generation (RAG), the system:</w:t>
       </w:r>
     </w:p>
     <w:p>
@@ -2360,7 +2379,7 @@
       <w:pPr>
         <w:pStyle w:val="Heading1"/>
       </w:pPr>
-      <w:bookmarkStart w:id="7" w:name="_Toc225245359"/>
+      <w:bookmarkStart w:id="7" w:name="_Toc225263335"/>
       <w:r>
         <w:t>2. System Overview</w:t>
       </w:r>
@@ -2377,7 +2396,7 @@
       <w:pPr>
         <w:pStyle w:val="Heading2"/>
       </w:pPr>
-      <w:bookmarkStart w:id="8" w:name="_Toc225245360"/>
+      <w:bookmarkStart w:id="8" w:name="_Toc225263336"/>
       <w:r>
         <w:t>Technical Stack</w:t>
       </w:r>
@@ -2923,7 +2942,7 @@
       <w:pPr>
         <w:pStyle w:val="Heading2"/>
       </w:pPr>
-      <w:bookmarkStart w:id="9" w:name="_Toc225245361"/>
+      <w:bookmarkStart w:id="9" w:name="_Toc225263337"/>
       <w:r>
         <w:t>Architecture Overview</w:t>
       </w:r>
@@ -2968,19 +2987,17 @@
         </w:rPr>
         <w:t xml:space="preserve"> A responsive React application featuring a drag-and-drop </w:t>
       </w:r>
-      <w:proofErr w:type="spellStart"/>
-      <w:r>
-        <w:rPr>
-          <w:rFonts w:ascii="Aptos" w:hAnsi="Aptos"/>
-        </w:rPr>
-        <w:t>mindmap</w:t>
-      </w:r>
-      <w:proofErr w:type="spellEnd"/>
-      <w:r>
-        <w:rPr>
-          <w:rFonts w:ascii="Aptos" w:hAnsi="Aptos"/>
-        </w:rPr>
-        <w:t xml:space="preserve"> editor powered by </w:t>
+      <w:r>
+        <w:rPr>
+          <w:rFonts w:ascii="Aptos" w:hAnsi="Aptos"/>
+        </w:rPr>
+        <w:t xml:space="preserve">mind-flow </w:t>
+      </w:r>
+      <w:r>
+        <w:rPr>
+          <w:rFonts w:ascii="Aptos" w:hAnsi="Aptos"/>
+        </w:rPr>
+        <w:t xml:space="preserve">editor powered by </w:t>
       </w:r>
       <w:proofErr w:type="spellStart"/>
       <w:r>
@@ -3129,7 +3146,7 @@
       <w:pPr>
         <w:pStyle w:val="Heading1"/>
       </w:pPr>
-      <w:bookmarkStart w:id="10" w:name="_Toc225245362"/>
+      <w:bookmarkStart w:id="10" w:name="_Toc225263338"/>
       <w:r>
         <w:t>3. Technical Implementation</w:t>
       </w:r>
@@ -3146,7 +3163,7 @@
       <w:pPr>
         <w:pStyle w:val="Heading2"/>
       </w:pPr>
-      <w:bookmarkStart w:id="11" w:name="_Toc225245363"/>
+      <w:bookmarkStart w:id="11" w:name="_Toc225263339"/>
       <w:r>
         <w:t>Key Features</w:t>
       </w:r>
@@ -3318,7 +3335,7 @@
       <w:pPr>
         <w:pStyle w:val="Heading2"/>
       </w:pPr>
-      <w:bookmarkStart w:id="12" w:name="_Toc225245364"/>
+      <w:bookmarkStart w:id="12" w:name="_Toc225263340"/>
       <w:r>
         <w:t>Core Logic and Workflow</w:t>
       </w:r>
@@ -3343,19 +3360,17 @@
         </w:rPr>
         <w:t xml:space="preserve">The system's functionality is built on a robust backend pipeline that handles both document ingestion and </w:t>
       </w:r>
-      <w:proofErr w:type="spellStart"/>
-      <w:r>
-        <w:rPr>
-          <w:rFonts w:ascii="Aptos" w:hAnsi="Aptos"/>
-        </w:rPr>
-        <w:t>mindmap</w:t>
-      </w:r>
-      <w:proofErr w:type="spellEnd"/>
-      <w:r>
-        <w:rPr>
-          <w:rFonts w:ascii="Aptos" w:hAnsi="Aptos"/>
-        </w:rPr>
-        <w:t xml:space="preserve"> evaluation.</w:t>
+      <w:r>
+        <w:rPr>
+          <w:rFonts w:ascii="Aptos" w:hAnsi="Aptos"/>
+        </w:rPr>
+        <w:t xml:space="preserve">mind-flow </w:t>
+      </w:r>
+      <w:r>
+        <w:rPr>
+          <w:rFonts w:ascii="Aptos" w:hAnsi="Aptos"/>
+        </w:rPr>
+        <w:t>evaluation.</w:t>
       </w:r>
     </w:p>
     <w:p>
@@ -3563,7 +3578,23 @@
           <w:b/>
           <w:bCs/>
         </w:rPr>
-        <w:t>3. Mind Map Evaluation Workflow:</w:t>
+        <w:t xml:space="preserve">3. Mind </w:t>
+      </w:r>
+      <w:r>
+        <w:rPr>
+          <w:rFonts w:ascii="Aptos" w:hAnsi="Aptos"/>
+          <w:b/>
+          <w:bCs/>
+        </w:rPr>
+        <w:t>Flow</w:t>
+      </w:r>
+      <w:r>
+        <w:rPr>
+          <w:rFonts w:ascii="Aptos" w:hAnsi="Aptos"/>
+          <w:b/>
+          <w:bCs/>
+        </w:rPr>
+        <w:t xml:space="preserve"> Evaluation Workflow:</w:t>
       </w:r>
     </w:p>
     <w:p>
@@ -3588,7 +3619,19 @@
         <w:rPr>
           <w:rFonts w:ascii="Aptos" w:hAnsi="Aptos"/>
         </w:rPr>
-        <w:t xml:space="preserve"> When a mind map JSON is submitted, the backend retrieves all stored "ground-truth" topics from the database based on the associated Module and Exercise IDs.</w:t>
+        <w:t xml:space="preserve"> When a </w:t>
+      </w:r>
+      <w:r>
+        <w:rPr>
+          <w:rFonts w:ascii="Aptos" w:hAnsi="Aptos"/>
+        </w:rPr>
+        <w:t xml:space="preserve">mind-flow </w:t>
+      </w:r>
+      <w:r>
+        <w:rPr>
+          <w:rFonts w:ascii="Aptos" w:hAnsi="Aptos"/>
+        </w:rPr>
+        <w:t>JSON is submitted, the backend retrieves all stored "ground-truth" topics from the database based on the associated Module and Exercise IDs.</w:t>
       </w:r>
     </w:p>
     <w:p>
@@ -3613,7 +3656,19 @@
         <w:rPr>
           <w:rFonts w:ascii="Aptos" w:hAnsi="Aptos"/>
         </w:rPr>
-        <w:t xml:space="preserve"> The system compares topics from the database with topics from the student's mind map JSON to produce lists of matched and unmatched topics.</w:t>
+        <w:t xml:space="preserve"> The system compares topics from the database with topics from the student's </w:t>
+      </w:r>
+      <w:r>
+        <w:rPr>
+          <w:rFonts w:ascii="Aptos" w:hAnsi="Aptos"/>
+        </w:rPr>
+        <w:t xml:space="preserve">mind-flow </w:t>
+      </w:r>
+      <w:r>
+        <w:rPr>
+          <w:rFonts w:ascii="Aptos" w:hAnsi="Aptos"/>
+        </w:rPr>
+        <w:t>JSON to produce lists of matched and unmatched topics.</w:t>
       </w:r>
     </w:p>
     <w:p>
@@ -3728,7 +3783,7 @@
       <w:pPr>
         <w:pStyle w:val="Heading1"/>
       </w:pPr>
-      <w:bookmarkStart w:id="13" w:name="_Toc225245365"/>
+      <w:bookmarkStart w:id="13" w:name="_Toc225263341"/>
       <w:r>
         <w:t>4. Advanced AI Capability: Model Fine-Tuning</w:t>
       </w:r>
@@ -3753,19 +3808,29 @@
         </w:rPr>
         <w:t xml:space="preserve">A central pillar of </w:t>
       </w:r>
-      <w:proofErr w:type="spellStart"/>
-      <w:r>
-        <w:rPr>
-          <w:rFonts w:ascii="Aptos" w:hAnsi="Aptos"/>
-        </w:rPr>
-        <w:t>AgenticContentFlow's</w:t>
-      </w:r>
-      <w:proofErr w:type="spellEnd"/>
-      <w:r>
-        <w:rPr>
-          <w:rFonts w:ascii="Aptos" w:hAnsi="Aptos"/>
-        </w:rPr>
-        <w:t xml:space="preserve"> performance is its specialized model fine-tuning process, which was undertaken to overcome the limitations of using a base model.</w:t>
+      <w:r>
+        <w:rPr>
+          <w:rFonts w:ascii="Aptos" w:hAnsi="Aptos"/>
+        </w:rPr>
+        <w:t>mind-flow</w:t>
+      </w:r>
+      <w:r>
+        <w:rPr>
+          <w:rFonts w:ascii="Aptos" w:hAnsi="Aptos"/>
+        </w:rPr>
+        <w:t>’s</w:t>
+      </w:r>
+      <w:r>
+        <w:rPr>
+          <w:rFonts w:ascii="Aptos" w:hAnsi="Aptos"/>
+        </w:rPr>
+        <w:t xml:space="preserve"> </w:t>
+      </w:r>
+      <w:r>
+        <w:rPr>
+          <w:rFonts w:ascii="Aptos" w:hAnsi="Aptos"/>
+        </w:rPr>
+        <w:t>performance is its specialized model fine-tuning process, which was undertaken to overcome the limitations of using a base model.</w:t>
       </w:r>
     </w:p>
     <w:p>
@@ -3779,7 +3844,7 @@
       <w:pPr>
         <w:pStyle w:val="Heading2"/>
       </w:pPr>
-      <w:bookmarkStart w:id="14" w:name="_Toc225245366"/>
+      <w:bookmarkStart w:id="14" w:name="_Toc225263342"/>
       <w:r>
         <w:t>Initial Challenges with Base Models</w:t>
       </w:r>
@@ -3872,7 +3937,7 @@
       <w:pPr>
         <w:pStyle w:val="Heading2"/>
       </w:pPr>
-      <w:bookmarkStart w:id="15" w:name="_Toc225245367"/>
+      <w:bookmarkStart w:id="15" w:name="_Toc225263343"/>
       <w:r>
         <w:t>Dataset Creation</w:t>
       </w:r>
@@ -3913,13 +3978,37 @@
         <w:rPr>
           <w:rFonts w:ascii="Aptos" w:hAnsi="Aptos"/>
         </w:rPr>
-        <w:t>mind map</w:t>
-      </w:r>
-      <w:r>
-        <w:rPr>
-          <w:rFonts w:ascii="Aptos" w:hAnsi="Aptos"/>
-        </w:rPr>
-        <w:t xml:space="preserve"> evaluation data to ensure high coverage of diverse educational scenarios, as reliable, real-world datasets for mind maps were not available. The dataset included multiple variations, from 10% to 100% semantic similarity within a specific domain.</w:t>
+        <w:t xml:space="preserve">mind-flow </w:t>
+      </w:r>
+      <w:r>
+        <w:rPr>
+          <w:rFonts w:ascii="Aptos" w:hAnsi="Aptos"/>
+        </w:rPr>
+        <w:t xml:space="preserve">evaluation data to ensure high coverage of diverse educational scenarios, as reliable, real-world datasets for </w:t>
+      </w:r>
+      <w:r>
+        <w:rPr>
+          <w:rFonts w:ascii="Aptos" w:hAnsi="Aptos"/>
+        </w:rPr>
+        <w:t>mind-flow</w:t>
+      </w:r>
+      <w:r>
+        <w:rPr>
+          <w:rFonts w:ascii="Aptos" w:hAnsi="Aptos"/>
+        </w:rPr>
+        <w:t>s</w:t>
+      </w:r>
+      <w:r>
+        <w:rPr>
+          <w:rFonts w:ascii="Aptos" w:hAnsi="Aptos"/>
+        </w:rPr>
+        <w:t xml:space="preserve"> </w:t>
+      </w:r>
+      <w:r>
+        <w:rPr>
+          <w:rFonts w:ascii="Aptos" w:hAnsi="Aptos"/>
+        </w:rPr>
+        <w:t>were not available. The dataset included multiple variations, from 10% to 100% semantic similarity within a specific domain.</w:t>
       </w:r>
     </w:p>
     <w:p>
@@ -4040,7 +4129,7 @@
       <w:pPr>
         <w:pStyle w:val="Heading2"/>
       </w:pPr>
-      <w:bookmarkStart w:id="16" w:name="_Toc225245368"/>
+      <w:bookmarkStart w:id="16" w:name="_Toc225263344"/>
       <w:r>
         <w:t>Fine-Tuning Process</w:t>
       </w:r>
@@ -4465,7 +4554,7 @@
       <w:pPr>
         <w:pStyle w:val="Heading1"/>
       </w:pPr>
-      <w:bookmarkStart w:id="17" w:name="_Toc225245369"/>
+      <w:bookmarkStart w:id="17" w:name="_Toc225263345"/>
       <w:r>
         <w:t>5. Development Journey: Experimentation &amp; Iteration</w:t>
       </w:r>
@@ -4482,7 +4571,7 @@
       <w:pPr>
         <w:pStyle w:val="Heading2"/>
       </w:pPr>
-      <w:bookmarkStart w:id="18" w:name="_Toc225245370"/>
+      <w:bookmarkStart w:id="18" w:name="_Toc225263346"/>
       <w:r>
         <w:t>Evidence of Experimentation</w:t>
       </w:r>
@@ -4643,7 +4732,7 @@
       <w:pPr>
         <w:pStyle w:val="Heading2"/>
       </w:pPr>
-      <w:bookmarkStart w:id="19" w:name="_Toc225245371"/>
+      <w:bookmarkStart w:id="19" w:name="_Toc225263347"/>
       <w:r>
         <w:t>Key Challenges &amp; Solutions</w:t>
       </w:r>
@@ -5222,7 +5311,7 @@
       <w:pPr>
         <w:pStyle w:val="Heading1"/>
       </w:pPr>
-      <w:bookmarkStart w:id="20" w:name="_Toc225245372"/>
+      <w:bookmarkStart w:id="20" w:name="_Toc225263348"/>
       <w:r>
         <w:t xml:space="preserve">6. </w:t>
       </w:r>
@@ -5242,19 +5331,7 @@
         <w:rPr>
           <w:rFonts w:ascii="Aptos" w:hAnsi="Aptos"/>
         </w:rPr>
-        <w:t>To quantitatively evaluate the effectiveness of our fine-tuning process, we conducted a comparative analysis between the base model (Llama 3.2) and our specialized fine-tuned model (Kiran 2.0). A test set of 100 mind map evaluation samples was used, with a correctness</w:t>
-      </w:r>
-      <w:r>
-        <w:rPr>
-          <w:rFonts w:ascii="Aptos" w:hAnsi="Aptos"/>
-        </w:rPr>
-        <w:t>-</w:t>
-      </w:r>
-      <w:r>
-        <w:rPr>
-          <w:rFonts w:ascii="Aptos" w:hAnsi="Aptos"/>
-        </w:rPr>
-        <w:t>threshold of ±0.15 points from the ground truth.</w:t>
+        <w:t>To quantitatively evaluate the effectiveness of our fine-tuning process, we conducted a comparative analysis between the base model (Llama 3.2) and our specialized fine-tuned model (Kiran 2.0). A test set of 100 mind-flow evaluation samples was used, with a correctness threshold of ±0.15 points from the ground truth.</w:t>
       </w:r>
     </w:p>
     <w:p>
@@ -5264,12 +5341,26 @@
           <w:rFonts w:ascii="Aptos" w:hAnsi="Aptos"/>
         </w:rPr>
       </w:pPr>
+      <w:r>
+        <w:rPr>
+          <w:rFonts w:ascii="Aptos" w:hAnsi="Aptos"/>
+        </w:rPr>
+        <w:t>The threshold selection is informed by the structure of our evaluation dataset, which originally considered three assessment criteria: (1) missing main points, (2) invalid connections, and (3) missing details in student responses. However, the third criterion was excluded from the current evaluation phase. This decision was made because identifying missing details requires broader contextual understanding, which tends to increase hallucination rates in smaller models (e.g., 3B parameter models) and significantly impacts response latency. Consequently, the evaluation framework focuses on the first two criteria to ensure more reliable and efficient model assessment.</w:t>
+      </w:r>
+    </w:p>
+    <w:p>
+      <w:pPr>
+        <w:pStyle w:val="BodyText"/>
+        <w:rPr>
+          <w:rFonts w:ascii="Aptos" w:hAnsi="Aptos"/>
+        </w:rPr>
+      </w:pPr>
     </w:p>
     <w:p>
       <w:pPr>
         <w:pStyle w:val="Heading2"/>
       </w:pPr>
-      <w:bookmarkStart w:id="21" w:name="_Toc225245373"/>
+      <w:bookmarkStart w:id="21" w:name="_Toc225263349"/>
       <w:r>
         <w:t>Summary Statistics</w:t>
       </w:r>
@@ -5483,7 +5574,7 @@
       <w:pPr>
         <w:pStyle w:val="Heading2"/>
       </w:pPr>
-      <w:bookmarkStart w:id="22" w:name="_Toc225245374"/>
+      <w:bookmarkStart w:id="22" w:name="_Toc225263350"/>
       <w:r>
         <w:t>Performance Analysis</w:t>
       </w:r>
@@ -5552,7 +5643,14 @@
         <w:rPr>
           <w:rFonts w:ascii="Aptos" w:hAnsi="Aptos"/>
         </w:rPr>
-        <w:t> The fine-tuned model showed a stronger tendency to produce scores closer to the ground truth. While Llama 3.2 often produced scores at the extremes (either too high or too low), Kiran 2.0's predictions were more tightly clustered around the expected values.</w:t>
+        <w:t xml:space="preserve"> The fine-tuned model showed a stronger tendency to produce scores closer to the ground truth. While Llama 3.2 often produced scores at the extremes (either </w:t>
+      </w:r>
+      <w:r>
+        <w:rPr>
+          <w:rFonts w:ascii="Aptos" w:hAnsi="Aptos"/>
+        </w:rPr>
+        <w:lastRenderedPageBreak/>
+        <w:t>too high or too low), Kiran 2.0's predictions were more tightly clustered around the expected values.</w:t>
       </w:r>
     </w:p>
     <w:p>
@@ -5598,38 +5696,13 @@
           <w:b/>
           <w:bCs/>
         </w:rPr>
-        <w:lastRenderedPageBreak/>
         <w:t>Response Time Efficiency:</w:t>
       </w:r>
       <w:r>
         <w:rPr>
           <w:rFonts w:ascii="Aptos" w:hAnsi="Aptos"/>
         </w:rPr>
-        <w:t xml:space="preserve"> Kiran 2.0 demonstrated significantly faster processing, completing evaluation of 100 samples in 2 </w:t>
-      </w:r>
-      <w:r>
-        <w:rPr>
-          <w:rFonts w:ascii="Aptos" w:hAnsi="Aptos"/>
-        </w:rPr>
-        <w:t>hr.</w:t>
-      </w:r>
-      <w:r>
-        <w:rPr>
-          <w:rFonts w:ascii="Aptos" w:hAnsi="Aptos"/>
-        </w:rPr>
-        <w:t xml:space="preserve"> 18 min, compared to 7 </w:t>
-      </w:r>
-      <w:r>
-        <w:rPr>
-          <w:rFonts w:ascii="Aptos" w:hAnsi="Aptos"/>
-        </w:rPr>
-        <w:t>hr.</w:t>
-      </w:r>
-      <w:r>
-        <w:rPr>
-          <w:rFonts w:ascii="Aptos" w:hAnsi="Aptos"/>
-        </w:rPr>
-        <w:t xml:space="preserve"> 10 min for Llama 3.2. This improvement highlights better efficiency and makes Kiran 2.0 more suitable for real-time or large-scale evaluation scenarios.</w:t>
+        <w:t xml:space="preserve"> Kiran 2.0 demonstrated significantly faster processing, completing evaluation of 100 samples in 2 hr. 18 min, compared to 7 hr. 10 min for Llama 3.2. This improvement highlights better efficiency and makes Kiran 2.0 more suitable for real-time or large-scale evaluation scenarios.</w:t>
       </w:r>
     </w:p>
     <w:p>
@@ -5838,25 +5911,7 @@
               <w:rPr>
                 <w:rFonts w:ascii="Aptos" w:hAnsi="Aptos"/>
               </w:rPr>
-              <w:t xml:space="preserve">Closer to ground </w:t>
-            </w:r>
-            <w:r>
-              <w:rPr>
-                <w:rFonts w:ascii="Aptos" w:hAnsi="Aptos"/>
-              </w:rPr>
-              <w:t>actual</w:t>
-            </w:r>
-            <w:r>
-              <w:rPr>
-                <w:rFonts w:ascii="Aptos" w:hAnsi="Aptos"/>
-              </w:rPr>
-              <w:t xml:space="preserve"> </w:t>
-            </w:r>
-            <w:r>
-              <w:rPr>
-                <w:rFonts w:ascii="Aptos" w:hAnsi="Aptos"/>
-              </w:rPr>
-              <w:t>scores.</w:t>
+              <w:t>Closer to ground actual scores.</w:t>
             </w:r>
           </w:p>
         </w:tc>
@@ -5999,14 +6054,11 @@
         <w:pStyle w:val="BodyText"/>
         <w:rPr>
           <w:rFonts w:ascii="Aptos" w:hAnsi="Aptos"/>
-          <w:lang w:val="fi-FI"/>
-        </w:rPr>
-      </w:pPr>
-      <w:r>
-        <w:rPr>
-          <w:rFonts w:ascii="Aptos" w:hAnsi="Aptos"/>
-          <w:noProof/>
-          <w:lang w:val="fi-FI"/>
+        </w:rPr>
+      </w:pPr>
+      <w:r>
+        <w:rPr>
+          <w:rFonts w:ascii="Aptos" w:hAnsi="Aptos"/>
         </w:rPr>
         <w:drawing>
           <wp:inline distT="0" distB="0" distL="0" distR="0" wp14:anchorId="01D7DE8F" wp14:editId="36ACC871">
@@ -6092,9 +6144,8 @@
       <w:pPr>
         <w:pStyle w:val="Heading1"/>
       </w:pPr>
-      <w:bookmarkStart w:id="23" w:name="_Toc225245375"/>
-      <w:r>
-        <w:lastRenderedPageBreak/>
+      <w:bookmarkStart w:id="23" w:name="_Toc225263351"/>
+      <w:r>
         <w:t>7</w:t>
       </w:r>
       <w:r>
@@ -6113,7 +6164,7 @@
       <w:pPr>
         <w:pStyle w:val="Heading2"/>
       </w:pPr>
-      <w:bookmarkStart w:id="24" w:name="_Toc225245376"/>
+      <w:bookmarkStart w:id="24" w:name="_Toc225263352"/>
       <w:r>
         <w:t>Key Takeaways</w:t>
       </w:r>
@@ -6373,7 +6424,7 @@
       <w:pPr>
         <w:pStyle w:val="Heading2"/>
       </w:pPr>
-      <w:bookmarkStart w:id="25" w:name="_Toc225245377"/>
+      <w:bookmarkStart w:id="25" w:name="_Toc225263353"/>
       <w:r>
         <w:t>Future Work</w:t>
       </w:r>
@@ -6516,7 +6567,7 @@
       <w:pPr>
         <w:pStyle w:val="Heading1"/>
       </w:pPr>
-      <w:bookmarkStart w:id="26" w:name="_Toc225245378"/>
+      <w:bookmarkStart w:id="26" w:name="_Toc225263354"/>
       <w:r>
         <w:t>8</w:t>
       </w:r>
@@ -6538,31 +6589,23 @@
           <w:rFonts w:ascii="Aptos" w:hAnsi="Aptos"/>
         </w:rPr>
       </w:pPr>
-      <w:proofErr w:type="spellStart"/>
-      <w:r>
-        <w:rPr>
-          <w:rFonts w:ascii="Aptos" w:hAnsi="Aptos"/>
-        </w:rPr>
-        <w:t>Mind</w:t>
-      </w:r>
-      <w:r>
-        <w:rPr>
-          <w:rFonts w:ascii="Aptos" w:hAnsi="Aptos"/>
-        </w:rPr>
-        <w:t>m</w:t>
-      </w:r>
-      <w:r>
-        <w:rPr>
-          <w:rFonts w:ascii="Aptos" w:hAnsi="Aptos"/>
-        </w:rPr>
-        <w:t>ap</w:t>
-      </w:r>
-      <w:proofErr w:type="spellEnd"/>
-      <w:r>
-        <w:rPr>
-          <w:rFonts w:ascii="Aptos" w:hAnsi="Aptos"/>
-        </w:rPr>
-        <w:t xml:space="preserve"> is not just a tool for </w:t>
+      <w:r>
+        <w:rPr>
+          <w:rFonts w:ascii="Aptos" w:hAnsi="Aptos"/>
+        </w:rPr>
+        <w:t>M</w:t>
+      </w:r>
+      <w:r>
+        <w:rPr>
+          <w:rFonts w:ascii="Aptos" w:hAnsi="Aptos"/>
+        </w:rPr>
+        <w:t xml:space="preserve">ind-flow </w:t>
+      </w:r>
+      <w:r>
+        <w:rPr>
+          <w:rFonts w:ascii="Aptos" w:hAnsi="Aptos"/>
+        </w:rPr>
+        <w:t xml:space="preserve">is not just a tool for </w:t>
       </w:r>
       <w:r>
         <w:rPr>
@@ -6622,14 +6665,7 @@
         <w:rPr>
           <w:rFonts w:ascii="Aptos" w:hAnsi="Aptos"/>
         </w:rPr>
-        <w:t xml:space="preserve"> </w:t>
-      </w:r>
-      <w:r>
-        <w:rPr>
-          <w:rFonts w:ascii="Aptos" w:hAnsi="Aptos"/>
-        </w:rPr>
-        <w:lastRenderedPageBreak/>
-        <w:t>educational experience that is cost-effective, and pedagogically sound. The project successfully transitioned from a concept to a functional system with a fully implemented backend, a responsive frontend, and an AI evaluation core that was significantly improved through a dedicated fine-tuning process. This platform lays a strong foundation for future enhancements that can further enrich the learning experience.</w:t>
+        <w:t xml:space="preserve"> educational experience that is cost-effective, and pedagogically sound. The project successfully transitioned from a concept to a functional system with a fully implemented backend, a responsive frontend, and an AI evaluation core that was significantly improved through a dedicated fine-tuning process. This platform lays a strong foundation for future enhancements that can further enrich the learning experience.</w:t>
       </w:r>
       <w:bookmarkEnd w:id="0"/>
       <w:bookmarkEnd w:id="1"/>

</xml_diff>

<commit_message>
feat: Implement LLM service for topic extraction and RAG-based flow validation, including integration with a custom Kiran inference model.
</commit_message>
<xml_diff>
--- a/Documentation/project_report.docx
+++ b/Documentation/project_report.docx
@@ -11,8 +11,11 @@
       <w:bookmarkStart w:id="0" w:name="Xf9f4e726d0013724d2e6d75d91d35965e2f0fc5"/>
       <w:bookmarkStart w:id="1" w:name="conclusion"/>
       <w:r>
+        <w:rPr>
+          <w:noProof/>
+        </w:rPr>
         <w:drawing>
-          <wp:inline distT="0" distB="0" distL="0" distR="0" wp14:anchorId="744E01F7" wp14:editId="5BD987C6">
+          <wp:inline distT="0" distB="0" distL="0" distR="0" wp14:anchorId="744E01F7" wp14:editId="205D1F88">
             <wp:extent cx="2110740" cy="823172"/>
             <wp:effectExtent l="0" t="0" r="0" b="0"/>
             <wp:docPr id="1370940288" name="Picture 1"/>
@@ -260,12 +263,84 @@
           <w:r>
             <w:fldChar w:fldCharType="separate"/>
           </w:r>
-          <w:hyperlink w:anchor="_Toc225263330" w:history="1">
+          <w:hyperlink w:anchor="_Toc225366680" w:history="1">
             <w:r>
               <w:rPr>
                 <w:rStyle w:val="Hyperlink"/>
                 <w:noProof/>
               </w:rPr>
+              <w:t>GitHub Repository</w:t>
+            </w:r>
+            <w:r>
+              <w:rPr>
+                <w:noProof/>
+                <w:webHidden/>
+              </w:rPr>
+              <w:tab/>
+            </w:r>
+            <w:r>
+              <w:rPr>
+                <w:noProof/>
+                <w:webHidden/>
+              </w:rPr>
+              <w:fldChar w:fldCharType="begin"/>
+            </w:r>
+            <w:r>
+              <w:rPr>
+                <w:noProof/>
+                <w:webHidden/>
+              </w:rPr>
+              <w:instrText xml:space="preserve"> PAGEREF _Toc225366680 \h </w:instrText>
+            </w:r>
+            <w:r>
+              <w:rPr>
+                <w:noProof/>
+                <w:webHidden/>
+              </w:rPr>
+            </w:r>
+            <w:r>
+              <w:rPr>
+                <w:noProof/>
+                <w:webHidden/>
+              </w:rPr>
+              <w:fldChar w:fldCharType="separate"/>
+            </w:r>
+            <w:r>
+              <w:rPr>
+                <w:noProof/>
+                <w:webHidden/>
+              </w:rPr>
+              <w:t>3</w:t>
+            </w:r>
+            <w:r>
+              <w:rPr>
+                <w:noProof/>
+                <w:webHidden/>
+              </w:rPr>
+              <w:fldChar w:fldCharType="end"/>
+            </w:r>
+          </w:hyperlink>
+        </w:p>
+        <w:p>
+          <w:pPr>
+            <w:pStyle w:val="TOC1"/>
+            <w:tabs>
+              <w:tab w:val="right" w:leader="dot" w:pos="9962"/>
+            </w:tabs>
+            <w:rPr>
+              <w:rFonts w:eastAsiaTheme="minorEastAsia"/>
+              <w:noProof/>
+              <w:kern w:val="2"/>
+              <w:lang w:val="fi-FI" w:eastAsia="fi-FI"/>
+              <w14:ligatures w14:val="standardContextual"/>
+            </w:rPr>
+          </w:pPr>
+          <w:hyperlink w:anchor="_Toc225366681" w:history="1">
+            <w:r>
+              <w:rPr>
+                <w:rStyle w:val="Hyperlink"/>
+                <w:noProof/>
+              </w:rPr>
               <w:t>1. Project Overview</w:t>
             </w:r>
             <w:r>
@@ -287,7 +362,7 @@
                 <w:noProof/>
                 <w:webHidden/>
               </w:rPr>
-              <w:instrText xml:space="preserve"> PAGEREF _Toc225263330 \h </w:instrText>
+              <w:instrText xml:space="preserve"> PAGEREF _Toc225366681 \h </w:instrText>
             </w:r>
             <w:r>
               <w:rPr>
@@ -332,7 +407,7 @@
               <w14:ligatures w14:val="standardContextual"/>
             </w:rPr>
           </w:pPr>
-          <w:hyperlink w:anchor="_Toc225263331" w:history="1">
+          <w:hyperlink w:anchor="_Toc225366682" w:history="1">
             <w:r>
               <w:rPr>
                 <w:rStyle w:val="Hyperlink"/>
@@ -359,7 +434,7 @@
                 <w:noProof/>
                 <w:webHidden/>
               </w:rPr>
-              <w:instrText xml:space="preserve"> PAGEREF _Toc225263331 \h </w:instrText>
+              <w:instrText xml:space="preserve"> PAGEREF _Toc225366682 \h </w:instrText>
             </w:r>
             <w:r>
               <w:rPr>
@@ -404,7 +479,7 @@
               <w14:ligatures w14:val="standardContextual"/>
             </w:rPr>
           </w:pPr>
-          <w:hyperlink w:anchor="_Toc225263332" w:history="1">
+          <w:hyperlink w:anchor="_Toc225366683" w:history="1">
             <w:r>
               <w:rPr>
                 <w:rStyle w:val="Hyperlink"/>
@@ -431,7 +506,7 @@
                 <w:noProof/>
                 <w:webHidden/>
               </w:rPr>
-              <w:instrText xml:space="preserve"> PAGEREF _Toc225263332 \h </w:instrText>
+              <w:instrText xml:space="preserve"> PAGEREF _Toc225366683 \h </w:instrText>
             </w:r>
             <w:r>
               <w:rPr>
@@ -476,7 +551,7 @@
               <w14:ligatures w14:val="standardContextual"/>
             </w:rPr>
           </w:pPr>
-          <w:hyperlink w:anchor="_Toc225263333" w:history="1">
+          <w:hyperlink w:anchor="_Toc225366684" w:history="1">
             <w:r>
               <w:rPr>
                 <w:rStyle w:val="Hyperlink"/>
@@ -503,7 +578,7 @@
                 <w:noProof/>
                 <w:webHidden/>
               </w:rPr>
-              <w:instrText xml:space="preserve"> PAGEREF _Toc225263333 \h </w:instrText>
+              <w:instrText xml:space="preserve"> PAGEREF _Toc225366684 \h </w:instrText>
             </w:r>
             <w:r>
               <w:rPr>
@@ -548,7 +623,7 @@
               <w14:ligatures w14:val="standardContextual"/>
             </w:rPr>
           </w:pPr>
-          <w:hyperlink w:anchor="_Toc225263334" w:history="1">
+          <w:hyperlink w:anchor="_Toc225366685" w:history="1">
             <w:r>
               <w:rPr>
                 <w:rStyle w:val="Hyperlink"/>
@@ -575,7 +650,7 @@
                 <w:noProof/>
                 <w:webHidden/>
               </w:rPr>
-              <w:instrText xml:space="preserve"> PAGEREF _Toc225263334 \h </w:instrText>
+              <w:instrText xml:space="preserve"> PAGEREF _Toc225366685 \h </w:instrText>
             </w:r>
             <w:r>
               <w:rPr>
@@ -620,7 +695,7 @@
               <w14:ligatures w14:val="standardContextual"/>
             </w:rPr>
           </w:pPr>
-          <w:hyperlink w:anchor="_Toc225263335" w:history="1">
+          <w:hyperlink w:anchor="_Toc225366686" w:history="1">
             <w:r>
               <w:rPr>
                 <w:rStyle w:val="Hyperlink"/>
@@ -647,7 +722,7 @@
                 <w:noProof/>
                 <w:webHidden/>
               </w:rPr>
-              <w:instrText xml:space="preserve"> PAGEREF _Toc225263335 \h </w:instrText>
+              <w:instrText xml:space="preserve"> PAGEREF _Toc225366686 \h </w:instrText>
             </w:r>
             <w:r>
               <w:rPr>
@@ -692,7 +767,7 @@
               <w14:ligatures w14:val="standardContextual"/>
             </w:rPr>
           </w:pPr>
-          <w:hyperlink w:anchor="_Toc225263336" w:history="1">
+          <w:hyperlink w:anchor="_Toc225366687" w:history="1">
             <w:r>
               <w:rPr>
                 <w:rStyle w:val="Hyperlink"/>
@@ -719,7 +794,7 @@
                 <w:noProof/>
                 <w:webHidden/>
               </w:rPr>
-              <w:instrText xml:space="preserve"> PAGEREF _Toc225263336 \h </w:instrText>
+              <w:instrText xml:space="preserve"> PAGEREF _Toc225366687 \h </w:instrText>
             </w:r>
             <w:r>
               <w:rPr>
@@ -739,7 +814,7 @@
                 <w:noProof/>
                 <w:webHidden/>
               </w:rPr>
-              <w:t>3</w:t>
+              <w:t>4</w:t>
             </w:r>
             <w:r>
               <w:rPr>
@@ -764,7 +839,7 @@
               <w14:ligatures w14:val="standardContextual"/>
             </w:rPr>
           </w:pPr>
-          <w:hyperlink w:anchor="_Toc225263337" w:history="1">
+          <w:hyperlink w:anchor="_Toc225366688" w:history="1">
             <w:r>
               <w:rPr>
                 <w:rStyle w:val="Hyperlink"/>
@@ -791,7 +866,7 @@
                 <w:noProof/>
                 <w:webHidden/>
               </w:rPr>
-              <w:instrText xml:space="preserve"> PAGEREF _Toc225263337 \h </w:instrText>
+              <w:instrText xml:space="preserve"> PAGEREF _Toc225366688 \h </w:instrText>
             </w:r>
             <w:r>
               <w:rPr>
@@ -836,7 +911,7 @@
               <w14:ligatures w14:val="standardContextual"/>
             </w:rPr>
           </w:pPr>
-          <w:hyperlink w:anchor="_Toc225263338" w:history="1">
+          <w:hyperlink w:anchor="_Toc225366689" w:history="1">
             <w:r>
               <w:rPr>
                 <w:rStyle w:val="Hyperlink"/>
@@ -863,7 +938,7 @@
                 <w:noProof/>
                 <w:webHidden/>
               </w:rPr>
-              <w:instrText xml:space="preserve"> PAGEREF _Toc225263338 \h </w:instrText>
+              <w:instrText xml:space="preserve"> PAGEREF _Toc225366689 \h </w:instrText>
             </w:r>
             <w:r>
               <w:rPr>
@@ -908,7 +983,7 @@
               <w14:ligatures w14:val="standardContextual"/>
             </w:rPr>
           </w:pPr>
-          <w:hyperlink w:anchor="_Toc225263339" w:history="1">
+          <w:hyperlink w:anchor="_Toc225366690" w:history="1">
             <w:r>
               <w:rPr>
                 <w:rStyle w:val="Hyperlink"/>
@@ -935,7 +1010,7 @@
                 <w:noProof/>
                 <w:webHidden/>
               </w:rPr>
-              <w:instrText xml:space="preserve"> PAGEREF _Toc225263339 \h </w:instrText>
+              <w:instrText xml:space="preserve"> PAGEREF _Toc225366690 \h </w:instrText>
             </w:r>
             <w:r>
               <w:rPr>
@@ -955,7 +1030,7 @@
                 <w:noProof/>
                 <w:webHidden/>
               </w:rPr>
-              <w:t>4</w:t>
+              <w:t>5</w:t>
             </w:r>
             <w:r>
               <w:rPr>
@@ -980,7 +1055,7 @@
               <w14:ligatures w14:val="standardContextual"/>
             </w:rPr>
           </w:pPr>
-          <w:hyperlink w:anchor="_Toc225263340" w:history="1">
+          <w:hyperlink w:anchor="_Toc225366691" w:history="1">
             <w:r>
               <w:rPr>
                 <w:rStyle w:val="Hyperlink"/>
@@ -1007,7 +1082,7 @@
                 <w:noProof/>
                 <w:webHidden/>
               </w:rPr>
-              <w:instrText xml:space="preserve"> PAGEREF _Toc225263340 \h </w:instrText>
+              <w:instrText xml:space="preserve"> PAGEREF _Toc225366691 \h </w:instrText>
             </w:r>
             <w:r>
               <w:rPr>
@@ -1052,7 +1127,7 @@
               <w14:ligatures w14:val="standardContextual"/>
             </w:rPr>
           </w:pPr>
-          <w:hyperlink w:anchor="_Toc225263341" w:history="1">
+          <w:hyperlink w:anchor="_Toc225366692" w:history="1">
             <w:r>
               <w:rPr>
                 <w:rStyle w:val="Hyperlink"/>
@@ -1079,7 +1154,7 @@
                 <w:noProof/>
                 <w:webHidden/>
               </w:rPr>
-              <w:instrText xml:space="preserve"> PAGEREF _Toc225263341 \h </w:instrText>
+              <w:instrText xml:space="preserve"> PAGEREF _Toc225366692 \h </w:instrText>
             </w:r>
             <w:r>
               <w:rPr>
@@ -1124,7 +1199,7 @@
               <w14:ligatures w14:val="standardContextual"/>
             </w:rPr>
           </w:pPr>
-          <w:hyperlink w:anchor="_Toc225263342" w:history="1">
+          <w:hyperlink w:anchor="_Toc225366693" w:history="1">
             <w:r>
               <w:rPr>
                 <w:rStyle w:val="Hyperlink"/>
@@ -1151,7 +1226,7 @@
                 <w:noProof/>
                 <w:webHidden/>
               </w:rPr>
-              <w:instrText xml:space="preserve"> PAGEREF _Toc225263342 \h </w:instrText>
+              <w:instrText xml:space="preserve"> PAGEREF _Toc225366693 \h </w:instrText>
             </w:r>
             <w:r>
               <w:rPr>
@@ -1196,7 +1271,7 @@
               <w14:ligatures w14:val="standardContextual"/>
             </w:rPr>
           </w:pPr>
-          <w:hyperlink w:anchor="_Toc225263343" w:history="1">
+          <w:hyperlink w:anchor="_Toc225366694" w:history="1">
             <w:r>
               <w:rPr>
                 <w:rStyle w:val="Hyperlink"/>
@@ -1223,7 +1298,7 @@
                 <w:noProof/>
                 <w:webHidden/>
               </w:rPr>
-              <w:instrText xml:space="preserve"> PAGEREF _Toc225263343 \h </w:instrText>
+              <w:instrText xml:space="preserve"> PAGEREF _Toc225366694 \h </w:instrText>
             </w:r>
             <w:r>
               <w:rPr>
@@ -1268,7 +1343,7 @@
               <w14:ligatures w14:val="standardContextual"/>
             </w:rPr>
           </w:pPr>
-          <w:hyperlink w:anchor="_Toc225263344" w:history="1">
+          <w:hyperlink w:anchor="_Toc225366695" w:history="1">
             <w:r>
               <w:rPr>
                 <w:rStyle w:val="Hyperlink"/>
@@ -1295,7 +1370,7 @@
                 <w:noProof/>
                 <w:webHidden/>
               </w:rPr>
-              <w:instrText xml:space="preserve"> PAGEREF _Toc225263344 \h </w:instrText>
+              <w:instrText xml:space="preserve"> PAGEREF _Toc225366695 \h </w:instrText>
             </w:r>
             <w:r>
               <w:rPr>
@@ -1315,7 +1390,7 @@
                 <w:noProof/>
                 <w:webHidden/>
               </w:rPr>
-              <w:t>6</w:t>
+              <w:t>7</w:t>
             </w:r>
             <w:r>
               <w:rPr>
@@ -1340,7 +1415,7 @@
               <w14:ligatures w14:val="standardContextual"/>
             </w:rPr>
           </w:pPr>
-          <w:hyperlink w:anchor="_Toc225263345" w:history="1">
+          <w:hyperlink w:anchor="_Toc225366696" w:history="1">
             <w:r>
               <w:rPr>
                 <w:rStyle w:val="Hyperlink"/>
@@ -1367,7 +1442,7 @@
                 <w:noProof/>
                 <w:webHidden/>
               </w:rPr>
-              <w:instrText xml:space="preserve"> PAGEREF _Toc225263345 \h </w:instrText>
+              <w:instrText xml:space="preserve"> PAGEREF _Toc225366696 \h </w:instrText>
             </w:r>
             <w:r>
               <w:rPr>
@@ -1412,7 +1487,7 @@
               <w14:ligatures w14:val="standardContextual"/>
             </w:rPr>
           </w:pPr>
-          <w:hyperlink w:anchor="_Toc225263346" w:history="1">
+          <w:hyperlink w:anchor="_Toc225366697" w:history="1">
             <w:r>
               <w:rPr>
                 <w:rStyle w:val="Hyperlink"/>
@@ -1439,7 +1514,7 @@
                 <w:noProof/>
                 <w:webHidden/>
               </w:rPr>
-              <w:instrText xml:space="preserve"> PAGEREF _Toc225263346 \h </w:instrText>
+              <w:instrText xml:space="preserve"> PAGEREF _Toc225366697 \h </w:instrText>
             </w:r>
             <w:r>
               <w:rPr>
@@ -1484,7 +1559,7 @@
               <w14:ligatures w14:val="standardContextual"/>
             </w:rPr>
           </w:pPr>
-          <w:hyperlink w:anchor="_Toc225263347" w:history="1">
+          <w:hyperlink w:anchor="_Toc225366698" w:history="1">
             <w:r>
               <w:rPr>
                 <w:rStyle w:val="Hyperlink"/>
@@ -1511,7 +1586,7 @@
                 <w:noProof/>
                 <w:webHidden/>
               </w:rPr>
-              <w:instrText xml:space="preserve"> PAGEREF _Toc225263347 \h </w:instrText>
+              <w:instrText xml:space="preserve"> PAGEREF _Toc225366698 \h </w:instrText>
             </w:r>
             <w:r>
               <w:rPr>
@@ -1556,7 +1631,7 @@
               <w14:ligatures w14:val="standardContextual"/>
             </w:rPr>
           </w:pPr>
-          <w:hyperlink w:anchor="_Toc225263348" w:history="1">
+          <w:hyperlink w:anchor="_Toc225366699" w:history="1">
             <w:r>
               <w:rPr>
                 <w:rStyle w:val="Hyperlink"/>
@@ -1583,7 +1658,7 @@
                 <w:noProof/>
                 <w:webHidden/>
               </w:rPr>
-              <w:instrText xml:space="preserve"> PAGEREF _Toc225263348 \h </w:instrText>
+              <w:instrText xml:space="preserve"> PAGEREF _Toc225366699 \h </w:instrText>
             </w:r>
             <w:r>
               <w:rPr>
@@ -1628,7 +1703,7 @@
               <w14:ligatures w14:val="standardContextual"/>
             </w:rPr>
           </w:pPr>
-          <w:hyperlink w:anchor="_Toc225263349" w:history="1">
+          <w:hyperlink w:anchor="_Toc225366700" w:history="1">
             <w:r>
               <w:rPr>
                 <w:rStyle w:val="Hyperlink"/>
@@ -1655,7 +1730,7 @@
                 <w:noProof/>
                 <w:webHidden/>
               </w:rPr>
-              <w:instrText xml:space="preserve"> PAGEREF _Toc225263349 \h </w:instrText>
+              <w:instrText xml:space="preserve"> PAGEREF _Toc225366700 \h </w:instrText>
             </w:r>
             <w:r>
               <w:rPr>
@@ -1700,7 +1775,7 @@
               <w14:ligatures w14:val="standardContextual"/>
             </w:rPr>
           </w:pPr>
-          <w:hyperlink w:anchor="_Toc225263350" w:history="1">
+          <w:hyperlink w:anchor="_Toc225366701" w:history="1">
             <w:r>
               <w:rPr>
                 <w:rStyle w:val="Hyperlink"/>
@@ -1727,7 +1802,7 @@
                 <w:noProof/>
                 <w:webHidden/>
               </w:rPr>
-              <w:instrText xml:space="preserve"> PAGEREF _Toc225263350 \h </w:instrText>
+              <w:instrText xml:space="preserve"> PAGEREF _Toc225366701 \h </w:instrText>
             </w:r>
             <w:r>
               <w:rPr>
@@ -1772,7 +1847,7 @@
               <w14:ligatures w14:val="standardContextual"/>
             </w:rPr>
           </w:pPr>
-          <w:hyperlink w:anchor="_Toc225263351" w:history="1">
+          <w:hyperlink w:anchor="_Toc225366702" w:history="1">
             <w:r>
               <w:rPr>
                 <w:rStyle w:val="Hyperlink"/>
@@ -1799,7 +1874,7 @@
                 <w:noProof/>
                 <w:webHidden/>
               </w:rPr>
-              <w:instrText xml:space="preserve"> PAGEREF _Toc225263351 \h </w:instrText>
+              <w:instrText xml:space="preserve"> PAGEREF _Toc225366702 \h </w:instrText>
             </w:r>
             <w:r>
               <w:rPr>
@@ -1844,7 +1919,7 @@
               <w14:ligatures w14:val="standardContextual"/>
             </w:rPr>
           </w:pPr>
-          <w:hyperlink w:anchor="_Toc225263352" w:history="1">
+          <w:hyperlink w:anchor="_Toc225366703" w:history="1">
             <w:r>
               <w:rPr>
                 <w:rStyle w:val="Hyperlink"/>
@@ -1871,7 +1946,7 @@
                 <w:noProof/>
                 <w:webHidden/>
               </w:rPr>
-              <w:instrText xml:space="preserve"> PAGEREF _Toc225263352 \h </w:instrText>
+              <w:instrText xml:space="preserve"> PAGEREF _Toc225366703 \h </w:instrText>
             </w:r>
             <w:r>
               <w:rPr>
@@ -1916,7 +1991,7 @@
               <w14:ligatures w14:val="standardContextual"/>
             </w:rPr>
           </w:pPr>
-          <w:hyperlink w:anchor="_Toc225263353" w:history="1">
+          <w:hyperlink w:anchor="_Toc225366704" w:history="1">
             <w:r>
               <w:rPr>
                 <w:rStyle w:val="Hyperlink"/>
@@ -1943,7 +2018,7 @@
                 <w:noProof/>
                 <w:webHidden/>
               </w:rPr>
-              <w:instrText xml:space="preserve"> PAGEREF _Toc225263353 \h </w:instrText>
+              <w:instrText xml:space="preserve"> PAGEREF _Toc225366704 \h </w:instrText>
             </w:r>
             <w:r>
               <w:rPr>
@@ -1963,7 +2038,7 @@
                 <w:noProof/>
                 <w:webHidden/>
               </w:rPr>
-              <w:t>11</w:t>
+              <w:t>12</w:t>
             </w:r>
             <w:r>
               <w:rPr>
@@ -1988,7 +2063,7 @@
               <w14:ligatures w14:val="standardContextual"/>
             </w:rPr>
           </w:pPr>
-          <w:hyperlink w:anchor="_Toc225263354" w:history="1">
+          <w:hyperlink w:anchor="_Toc225366705" w:history="1">
             <w:r>
               <w:rPr>
                 <w:rStyle w:val="Hyperlink"/>
@@ -2015,7 +2090,7 @@
                 <w:noProof/>
                 <w:webHidden/>
               </w:rPr>
-              <w:instrText xml:space="preserve"> PAGEREF _Toc225263354 \h </w:instrText>
+              <w:instrText xml:space="preserve"> PAGEREF _Toc225366705 \h </w:instrText>
             </w:r>
             <w:r>
               <w:rPr>
@@ -2071,46 +2146,63 @@
     </w:p>
     <w:p>
       <w:pPr>
-        <w:rPr>
-          <w:rFonts w:asciiTheme="majorHAnsi" w:eastAsiaTheme="majorEastAsia" w:hAnsiTheme="majorHAnsi" w:cstheme="majorBidi"/>
-          <w:b/>
-          <w:bCs/>
-          <w:color w:val="4F81BD" w:themeColor="accent1"/>
-          <w:sz w:val="32"/>
-          <w:szCs w:val="32"/>
-        </w:rPr>
+        <w:pStyle w:val="Heading1"/>
       </w:pPr>
       <w:r>
         <w:br w:type="page"/>
       </w:r>
+      <w:bookmarkStart w:id="2" w:name="_Toc225366680"/>
+      <w:r>
+        <w:lastRenderedPageBreak/>
+        <w:t>GitHub Repository</w:t>
+      </w:r>
+      <w:bookmarkEnd w:id="2"/>
+    </w:p>
+    <w:p>
+      <w:pPr>
+        <w:pStyle w:val="BodyText"/>
+      </w:pPr>
+      <w:r>
+        <w:t xml:space="preserve">GitHub Url: </w:t>
+      </w:r>
+      <w:hyperlink r:id="rId9" w:history="1">
+        <w:r>
+          <w:rPr>
+            <w:rStyle w:val="Hyperlink"/>
+          </w:rPr>
+          <w:t>GPT-Laboratory/Case-21-Group-mindflow: Automated Educational Concept Mapping</w:t>
+        </w:r>
+      </w:hyperlink>
+    </w:p>
+    <w:p>
+      <w:pPr>
+        <w:pStyle w:val="BodyText"/>
+      </w:pPr>
     </w:p>
     <w:p>
       <w:pPr>
         <w:pStyle w:val="Heading1"/>
       </w:pPr>
-      <w:bookmarkStart w:id="2" w:name="_Toc225263330"/>
-      <w:r>
-        <w:lastRenderedPageBreak/>
+      <w:bookmarkStart w:id="3" w:name="_Toc225366681"/>
+      <w:r>
         <w:t>1. Project Overview</w:t>
       </w:r>
-      <w:bookmarkEnd w:id="2"/>
-    </w:p>
-    <w:p>
-      <w:pPr>
-        <w:rPr>
-          <w:rFonts w:ascii="Aptos" w:hAnsi="Aptos"/>
-        </w:rPr>
+      <w:bookmarkEnd w:id="3"/>
+    </w:p>
+    <w:p>
+      <w:pPr>
+        <w:pStyle w:val="BodyText"/>
       </w:pPr>
     </w:p>
     <w:p>
       <w:pPr>
         <w:pStyle w:val="Heading2"/>
       </w:pPr>
-      <w:bookmarkStart w:id="3" w:name="_Toc225263331"/>
+      <w:bookmarkStart w:id="4" w:name="_Toc225366682"/>
       <w:r>
         <w:t>Summary of Objectives</w:t>
       </w:r>
-      <w:bookmarkEnd w:id="3"/>
+      <w:bookmarkEnd w:id="4"/>
     </w:p>
     <w:p>
       <w:pPr>
@@ -2134,19 +2226,7 @@
         <w:rPr>
           <w:rFonts w:ascii="Aptos" w:hAnsi="Aptos"/>
         </w:rPr>
-        <w:t>m</w:t>
-      </w:r>
-      <w:r>
-        <w:rPr>
-          <w:rFonts w:ascii="Aptos" w:hAnsi="Aptos"/>
-        </w:rPr>
-        <w:t>ind-flow</w:t>
-      </w:r>
-      <w:r>
-        <w:rPr>
-          <w:rFonts w:ascii="Aptos" w:hAnsi="Aptos"/>
-        </w:rPr>
-        <w:t>s</w:t>
+        <w:t>mind-flows</w:t>
       </w:r>
       <w:r>
         <w:rPr>
@@ -2166,24 +2246,24 @@
       <w:pPr>
         <w:pStyle w:val="Heading2"/>
       </w:pPr>
-      <w:bookmarkStart w:id="4" w:name="_Toc225263332"/>
+      <w:bookmarkStart w:id="5" w:name="_Toc225366683"/>
       <w:r>
         <w:t>Problem &amp; Solution</w:t>
       </w:r>
-      <w:bookmarkEnd w:id="4"/>
+      <w:bookmarkEnd w:id="5"/>
     </w:p>
     <w:p>
       <w:pPr>
         <w:pStyle w:val="Heading3"/>
       </w:pPr>
-      <w:bookmarkStart w:id="5" w:name="_Toc225263333"/>
+      <w:bookmarkStart w:id="6" w:name="_Toc225366684"/>
       <w:r>
         <w:t xml:space="preserve">Existing </w:t>
       </w:r>
       <w:r>
         <w:t>Problem</w:t>
       </w:r>
-      <w:bookmarkEnd w:id="5"/>
+      <w:bookmarkEnd w:id="6"/>
     </w:p>
     <w:p>
       <w:pPr>
@@ -2201,66 +2281,54 @@
         <w:rPr>
           <w:rFonts w:ascii="Aptos" w:hAnsi="Aptos"/>
         </w:rPr>
-        <w:t>mind-flow</w:t>
-      </w:r>
-      <w:r>
-        <w:rPr>
-          <w:rFonts w:ascii="Aptos" w:hAnsi="Aptos"/>
-        </w:rPr>
+        <w:t xml:space="preserve">mind-flow </w:t>
+      </w:r>
+      <w:r>
+        <w:rPr>
+          <w:rFonts w:ascii="Aptos" w:hAnsi="Aptos"/>
+        </w:rPr>
+        <w:t xml:space="preserve">is a manual, time-consuming process for educators. It is often subjective, lacks scalability, and provides slow feedback loops. For students, this means long </w:t>
+      </w:r>
+      <w:r>
+        <w:rPr>
+          <w:rFonts w:ascii="Aptos" w:hAnsi="Aptos"/>
+        </w:rPr>
+        <w:t>waiting</w:t>
+      </w:r>
+      <w:r>
+        <w:rPr>
+          <w:rFonts w:ascii="Aptos" w:hAnsi="Aptos"/>
+        </w:rPr>
+        <w:t xml:space="preserve"> times for corrective guidance, which can plateau their learning.</w:t>
+      </w:r>
+    </w:p>
+    <w:p>
+      <w:pPr>
+        <w:pStyle w:val="Heading3"/>
+      </w:pPr>
+      <w:bookmarkStart w:id="7" w:name="_Toc225366685"/>
+      <w:r>
+        <w:t xml:space="preserve">Possible </w:t>
+      </w:r>
+      <w:r>
+        <w:t>Solution</w:t>
+      </w:r>
+      <w:bookmarkEnd w:id="7"/>
+      <w:r>
         <w:t xml:space="preserve"> </w:t>
       </w:r>
-      <w:r>
-        <w:rPr>
-          <w:rFonts w:ascii="Aptos" w:hAnsi="Aptos"/>
-        </w:rPr>
-        <w:t xml:space="preserve">is a manual, time-consuming process for educators. It is often subjective, lacks scalability, and provides slow feedback loops. For students, this means long </w:t>
-      </w:r>
-      <w:r>
-        <w:rPr>
-          <w:rFonts w:ascii="Aptos" w:hAnsi="Aptos"/>
-        </w:rPr>
-        <w:t>waiting</w:t>
-      </w:r>
-      <w:r>
-        <w:rPr>
-          <w:rFonts w:ascii="Aptos" w:hAnsi="Aptos"/>
-        </w:rPr>
-        <w:t xml:space="preserve"> times for corrective guidance, which can plateau their learning.</w:t>
-      </w:r>
-    </w:p>
-    <w:p>
-      <w:pPr>
-        <w:pStyle w:val="Heading3"/>
-      </w:pPr>
-      <w:bookmarkStart w:id="6" w:name="_Toc225263334"/>
-      <w:r>
-        <w:t xml:space="preserve">Possible </w:t>
-      </w:r>
-      <w:r>
-        <w:t>Solution</w:t>
-      </w:r>
-      <w:bookmarkEnd w:id="6"/>
-      <w:r>
-        <w:t xml:space="preserve"> </w:t>
-      </w:r>
-    </w:p>
-    <w:p>
-      <w:pPr>
-        <w:rPr>
-          <w:rFonts w:ascii="Aptos" w:hAnsi="Aptos"/>
-        </w:rPr>
-      </w:pPr>
-      <w:r>
-        <w:rPr>
-          <w:rFonts w:ascii="Aptos" w:hAnsi="Aptos"/>
-        </w:rPr>
-        <w:t>M</w:t>
-      </w:r>
-      <w:r>
-        <w:rPr>
-          <w:rFonts w:ascii="Aptos" w:hAnsi="Aptos"/>
-        </w:rPr>
-        <w:t xml:space="preserve">ind-flow </w:t>
+    </w:p>
+    <w:p>
+      <w:pPr>
+        <w:rPr>
+          <w:rFonts w:ascii="Aptos" w:hAnsi="Aptos"/>
+        </w:rPr>
+      </w:pPr>
+      <w:r>
+        <w:rPr>
+          <w:rFonts w:ascii="Aptos" w:hAnsi="Aptos"/>
+        </w:rPr>
+        <w:t xml:space="preserve">Mind-flow </w:t>
       </w:r>
       <w:r>
         <w:rPr>
@@ -2379,11 +2447,11 @@
       <w:pPr>
         <w:pStyle w:val="Heading1"/>
       </w:pPr>
-      <w:bookmarkStart w:id="7" w:name="_Toc225263335"/>
+      <w:bookmarkStart w:id="8" w:name="_Toc225366686"/>
       <w:r>
         <w:t>2. System Overview</w:t>
       </w:r>
-      <w:bookmarkEnd w:id="7"/>
+      <w:bookmarkEnd w:id="8"/>
     </w:p>
     <w:p>
       <w:pPr>
@@ -2396,11 +2464,12 @@
       <w:pPr>
         <w:pStyle w:val="Heading2"/>
       </w:pPr>
-      <w:bookmarkStart w:id="8" w:name="_Toc225263336"/>
-      <w:r>
+      <w:bookmarkStart w:id="9" w:name="_Toc225366687"/>
+      <w:r>
+        <w:lastRenderedPageBreak/>
         <w:t>Technical Stack</w:t>
       </w:r>
-      <w:bookmarkEnd w:id="8"/>
+      <w:bookmarkEnd w:id="9"/>
     </w:p>
     <w:tbl>
       <w:tblPr>
@@ -2586,7 +2655,6 @@
               <w:rPr>
                 <w:rFonts w:ascii="Aptos" w:hAnsi="Aptos"/>
               </w:rPr>
-              <w:lastRenderedPageBreak/>
               <w:t>Backend</w:t>
             </w:r>
           </w:p>
@@ -2942,11 +3010,11 @@
       <w:pPr>
         <w:pStyle w:val="Heading2"/>
       </w:pPr>
-      <w:bookmarkStart w:id="9" w:name="_Toc225263337"/>
+      <w:bookmarkStart w:id="10" w:name="_Toc225366688"/>
       <w:r>
         <w:t>Architecture Overview</w:t>
       </w:r>
-      <w:bookmarkEnd w:id="9"/>
+      <w:bookmarkEnd w:id="10"/>
     </w:p>
     <w:p>
       <w:pPr>
@@ -3146,11 +3214,11 @@
       <w:pPr>
         <w:pStyle w:val="Heading1"/>
       </w:pPr>
-      <w:bookmarkStart w:id="10" w:name="_Toc225263338"/>
+      <w:bookmarkStart w:id="11" w:name="_Toc225366689"/>
       <w:r>
         <w:t>3. Technical Implementation</w:t>
       </w:r>
-      <w:bookmarkEnd w:id="10"/>
+      <w:bookmarkEnd w:id="11"/>
     </w:p>
     <w:p>
       <w:pPr>
@@ -3163,11 +3231,12 @@
       <w:pPr>
         <w:pStyle w:val="Heading2"/>
       </w:pPr>
-      <w:bookmarkStart w:id="11" w:name="_Toc225263339"/>
-      <w:r>
+      <w:bookmarkStart w:id="12" w:name="_Toc225366690"/>
+      <w:r>
+        <w:lastRenderedPageBreak/>
         <w:t>Key Features</w:t>
       </w:r>
-      <w:bookmarkEnd w:id="11"/>
+      <w:bookmarkEnd w:id="12"/>
     </w:p>
     <w:p>
       <w:pPr>
@@ -3238,7 +3307,6 @@
           <w:b/>
           <w:bCs/>
         </w:rPr>
-        <w:lastRenderedPageBreak/>
         <w:t>Dynamic Flow Validation</w:t>
       </w:r>
       <w:r>
@@ -3335,11 +3403,11 @@
       <w:pPr>
         <w:pStyle w:val="Heading2"/>
       </w:pPr>
-      <w:bookmarkStart w:id="12" w:name="_Toc225263340"/>
+      <w:bookmarkStart w:id="13" w:name="_Toc225366691"/>
       <w:r>
         <w:t>Core Logic and Workflow</w:t>
       </w:r>
-      <w:bookmarkEnd w:id="12"/>
+      <w:bookmarkEnd w:id="13"/>
     </w:p>
     <w:p>
       <w:pPr>
@@ -3613,6 +3681,7 @@
           <w:rFonts w:ascii="Aptos" w:hAnsi="Aptos"/>
           <w:u w:val="single"/>
         </w:rPr>
+        <w:lastRenderedPageBreak/>
         <w:t>Step 1: Fetch Topics:</w:t>
       </w:r>
       <w:r>
@@ -3712,7 +3781,6 @@
           <w:rFonts w:ascii="Aptos" w:hAnsi="Aptos"/>
           <w:u w:val="single"/>
         </w:rPr>
-        <w:lastRenderedPageBreak/>
         <w:t>Step 4: AI Evaluation:</w:t>
       </w:r>
       <w:r>
@@ -3783,11 +3851,11 @@
       <w:pPr>
         <w:pStyle w:val="Heading1"/>
       </w:pPr>
-      <w:bookmarkStart w:id="13" w:name="_Toc225263341"/>
+      <w:bookmarkStart w:id="14" w:name="_Toc225366692"/>
       <w:r>
         <w:t>4. Advanced AI Capability: Model Fine-Tuning</w:t>
       </w:r>
-      <w:bookmarkEnd w:id="13"/>
+      <w:bookmarkEnd w:id="14"/>
     </w:p>
     <w:p>
       <w:pPr>
@@ -3812,19 +3880,7 @@
         <w:rPr>
           <w:rFonts w:ascii="Aptos" w:hAnsi="Aptos"/>
         </w:rPr>
-        <w:t>mind-flow</w:t>
-      </w:r>
-      <w:r>
-        <w:rPr>
-          <w:rFonts w:ascii="Aptos" w:hAnsi="Aptos"/>
-        </w:rPr>
-        <w:t>’s</w:t>
-      </w:r>
-      <w:r>
-        <w:rPr>
-          <w:rFonts w:ascii="Aptos" w:hAnsi="Aptos"/>
-        </w:rPr>
-        <w:t xml:space="preserve"> </w:t>
+        <w:t xml:space="preserve">mind-flow’s </w:t>
       </w:r>
       <w:r>
         <w:rPr>
@@ -3844,11 +3900,11 @@
       <w:pPr>
         <w:pStyle w:val="Heading2"/>
       </w:pPr>
-      <w:bookmarkStart w:id="14" w:name="_Toc225263342"/>
+      <w:bookmarkStart w:id="15" w:name="_Toc225366693"/>
       <w:r>
         <w:t>Initial Challenges with Base Models</w:t>
       </w:r>
-      <w:bookmarkEnd w:id="14"/>
+      <w:bookmarkEnd w:id="15"/>
     </w:p>
     <w:p>
       <w:pPr>
@@ -3937,11 +3993,11 @@
       <w:pPr>
         <w:pStyle w:val="Heading2"/>
       </w:pPr>
-      <w:bookmarkStart w:id="15" w:name="_Toc225263343"/>
+      <w:bookmarkStart w:id="16" w:name="_Toc225366694"/>
       <w:r>
         <w:t>Dataset Creation</w:t>
       </w:r>
-      <w:bookmarkEnd w:id="15"/>
+      <w:bookmarkEnd w:id="16"/>
     </w:p>
     <w:p>
       <w:pPr>
@@ -3990,19 +4046,7 @@
         <w:rPr>
           <w:rFonts w:ascii="Aptos" w:hAnsi="Aptos"/>
         </w:rPr>
-        <w:t>mind-flow</w:t>
-      </w:r>
-      <w:r>
-        <w:rPr>
-          <w:rFonts w:ascii="Aptos" w:hAnsi="Aptos"/>
-        </w:rPr>
-        <w:t>s</w:t>
-      </w:r>
-      <w:r>
-        <w:rPr>
-          <w:rFonts w:ascii="Aptos" w:hAnsi="Aptos"/>
-        </w:rPr>
-        <w:t xml:space="preserve"> </w:t>
+        <w:t xml:space="preserve">mind-flows </w:t>
       </w:r>
       <w:r>
         <w:rPr>
@@ -4129,11 +4173,11 @@
       <w:pPr>
         <w:pStyle w:val="Heading2"/>
       </w:pPr>
-      <w:bookmarkStart w:id="16" w:name="_Toc225263344"/>
+      <w:bookmarkStart w:id="17" w:name="_Toc225366695"/>
       <w:r>
         <w:t>Fine-Tuning Process</w:t>
       </w:r>
-      <w:bookmarkEnd w:id="16"/>
+      <w:bookmarkEnd w:id="17"/>
     </w:p>
     <w:p>
       <w:pPr>
@@ -4210,7 +4254,6 @@
           <w:b/>
           <w:bCs/>
         </w:rPr>
-        <w:lastRenderedPageBreak/>
         <w:t>Training Data:</w:t>
       </w:r>
       <w:r>
@@ -4554,11 +4597,11 @@
       <w:pPr>
         <w:pStyle w:val="Heading1"/>
       </w:pPr>
-      <w:bookmarkStart w:id="17" w:name="_Toc225263345"/>
+      <w:bookmarkStart w:id="18" w:name="_Toc225366696"/>
       <w:r>
         <w:t>5. Development Journey: Experimentation &amp; Iteration</w:t>
       </w:r>
-      <w:bookmarkEnd w:id="17"/>
+      <w:bookmarkEnd w:id="18"/>
     </w:p>
     <w:p>
       <w:pPr>
@@ -4571,11 +4614,11 @@
       <w:pPr>
         <w:pStyle w:val="Heading2"/>
       </w:pPr>
-      <w:bookmarkStart w:id="18" w:name="_Toc225263346"/>
+      <w:bookmarkStart w:id="19" w:name="_Toc225366697"/>
       <w:r>
         <w:t>Evidence of Experimentation</w:t>
       </w:r>
-      <w:bookmarkEnd w:id="18"/>
+      <w:bookmarkEnd w:id="19"/>
     </w:p>
     <w:p>
       <w:pPr>
@@ -4732,11 +4775,11 @@
       <w:pPr>
         <w:pStyle w:val="Heading2"/>
       </w:pPr>
-      <w:bookmarkStart w:id="19" w:name="_Toc225263347"/>
+      <w:bookmarkStart w:id="20" w:name="_Toc225366698"/>
       <w:r>
         <w:t>Key Challenges &amp; Solutions</w:t>
       </w:r>
-      <w:bookmarkEnd w:id="19"/>
+      <w:bookmarkEnd w:id="20"/>
     </w:p>
     <w:p>
       <w:pPr>
@@ -4776,6 +4819,7 @@
         <w:rPr>
           <w:rFonts w:ascii="Aptos" w:hAnsi="Aptos"/>
         </w:rPr>
+        <w:lastRenderedPageBreak/>
         <w:br/>
       </w:r>
       <w:r>
@@ -4808,14 +4852,7 @@
         <w:rPr>
           <w:rFonts w:ascii="Aptos" w:hAnsi="Aptos"/>
         </w:rPr>
-        <w:t xml:space="preserve">Additionally, instead of sending the full document every time, a topic-matching system is used, and fetch only the mentioned topics information using Retrieval-Augmented </w:t>
-      </w:r>
-      <w:r>
-        <w:rPr>
-          <w:rFonts w:ascii="Aptos" w:hAnsi="Aptos"/>
-        </w:rPr>
-        <w:lastRenderedPageBreak/>
-        <w:t>Generation. This helps improve accuracy while reducing the token consumption for large data sending to the model.</w:t>
+        <w:t>Additionally, instead of sending the full document every time, a topic-matching system is used, and fetch only the mentioned topics information using Retrieval-Augmented Generation. This helps improve accuracy while reducing the token consumption for large data sending to the model.</w:t>
       </w:r>
     </w:p>
     <w:p>
@@ -5202,7 +5239,14 @@
         <w:rPr>
           <w:rFonts w:ascii="Aptos" w:hAnsi="Aptos"/>
         </w:rPr>
-        <w:t xml:space="preserve"> training environment. However, the local inference engine (Ollama) required models in the GGUF format for efficient CPU/GPU execution on local machines. This incompatibility created a gap between the training and deployment environments.</w:t>
+        <w:t xml:space="preserve"> training environment. However, the local inference engine (Ollama) required models in </w:t>
+      </w:r>
+      <w:r>
+        <w:rPr>
+          <w:rFonts w:ascii="Aptos" w:hAnsi="Aptos"/>
+        </w:rPr>
+        <w:lastRenderedPageBreak/>
+        <w:t>the GGUF format for efficient CPU/GPU execution on local machines. This incompatibility created a gap between the training and deployment environments.</w:t>
       </w:r>
     </w:p>
     <w:p>
@@ -5276,14 +5320,7 @@
         <w:rPr>
           <w:rFonts w:ascii="Aptos" w:hAnsi="Aptos"/>
         </w:rPr>
-        <w:t xml:space="preserve">-based testing and validation. A secondary conversion step was added for producing a GGUF quantized version specifically for local deployment with Ollama. This </w:t>
-      </w:r>
-      <w:r>
-        <w:rPr>
-          <w:rFonts w:ascii="Aptos" w:hAnsi="Aptos"/>
-        </w:rPr>
-        <w:lastRenderedPageBreak/>
-        <w:t xml:space="preserve">dual-format approach ensured seamless compatibility across both the </w:t>
+        <w:t xml:space="preserve">-based testing and validation. A secondary conversion step was added for producing a GGUF quantized version specifically for local deployment with Ollama. This dual-format approach ensured seamless compatibility across both the </w:t>
       </w:r>
       <w:proofErr w:type="spellStart"/>
       <w:r>
@@ -5311,14 +5348,14 @@
       <w:pPr>
         <w:pStyle w:val="Heading1"/>
       </w:pPr>
-      <w:bookmarkStart w:id="20" w:name="_Toc225263348"/>
+      <w:bookmarkStart w:id="21" w:name="_Toc225366699"/>
       <w:r>
         <w:t xml:space="preserve">6. </w:t>
       </w:r>
       <w:r>
         <w:t>Comparison between Llama3.2 and Kiran2.0</w:t>
       </w:r>
-      <w:bookmarkEnd w:id="20"/>
+      <w:bookmarkEnd w:id="21"/>
     </w:p>
     <w:p>
       <w:pPr>
@@ -5360,11 +5397,11 @@
       <w:pPr>
         <w:pStyle w:val="Heading2"/>
       </w:pPr>
-      <w:bookmarkStart w:id="21" w:name="_Toc225263349"/>
+      <w:bookmarkStart w:id="22" w:name="_Toc225366700"/>
       <w:r>
         <w:t>Summary Statistics</w:t>
       </w:r>
-      <w:bookmarkEnd w:id="21"/>
+      <w:bookmarkEnd w:id="22"/>
     </w:p>
     <w:tbl>
       <w:tblPr>
@@ -5574,11 +5611,11 @@
       <w:pPr>
         <w:pStyle w:val="Heading2"/>
       </w:pPr>
-      <w:bookmarkStart w:id="22" w:name="_Toc225263350"/>
+      <w:bookmarkStart w:id="23" w:name="_Toc225366701"/>
       <w:r>
         <w:t>Performance Analysis</w:t>
       </w:r>
-      <w:bookmarkEnd w:id="22"/>
+      <w:bookmarkEnd w:id="23"/>
     </w:p>
     <w:p>
       <w:pPr>
@@ -5611,6 +5648,7 @@
           <w:b/>
           <w:bCs/>
         </w:rPr>
+        <w:lastRenderedPageBreak/>
         <w:t>Correctness:</w:t>
       </w:r>
       <w:r>
@@ -5643,14 +5681,7 @@
         <w:rPr>
           <w:rFonts w:ascii="Aptos" w:hAnsi="Aptos"/>
         </w:rPr>
-        <w:t xml:space="preserve"> The fine-tuned model showed a stronger tendency to produce scores closer to the ground truth. While Llama 3.2 often produced scores at the extremes (either </w:t>
-      </w:r>
-      <w:r>
-        <w:rPr>
-          <w:rFonts w:ascii="Aptos" w:hAnsi="Aptos"/>
-        </w:rPr>
-        <w:lastRenderedPageBreak/>
-        <w:t>too high or too low), Kiran 2.0's predictions were more tightly clustered around the expected values.</w:t>
+        <w:t> The fine-tuned model showed a stronger tendency to produce scores closer to the ground truth. While Llama 3.2 often produced scores at the extremes (either too high or too low), Kiran 2.0's predictions were more tightly clustered around the expected values.</w:t>
       </w:r>
     </w:p>
     <w:p>
@@ -6059,7 +6090,9 @@
       <w:r>
         <w:rPr>
           <w:rFonts w:ascii="Aptos" w:hAnsi="Aptos"/>
-        </w:rPr>
+          <w:noProof/>
+        </w:rPr>
+        <w:lastRenderedPageBreak/>
         <w:drawing>
           <wp:inline distT="0" distB="0" distL="0" distR="0" wp14:anchorId="01D7DE8F" wp14:editId="36ACC871">
             <wp:extent cx="6370320" cy="2511425"/>
@@ -6078,7 +6111,7 @@
                     </pic:cNvPicPr>
                   </pic:nvPicPr>
                   <pic:blipFill>
-                    <a:blip r:embed="rId9">
+                    <a:blip r:embed="rId10">
                       <a:extLst>
                         <a:ext uri="{28A0092B-C50C-407E-A947-70E740481C1C}">
                           <a14:useLocalDpi xmlns:a14="http://schemas.microsoft.com/office/drawing/2010/main" val="0"/>
@@ -6144,14 +6177,14 @@
       <w:pPr>
         <w:pStyle w:val="Heading1"/>
       </w:pPr>
-      <w:bookmarkStart w:id="23" w:name="_Toc225263351"/>
+      <w:bookmarkStart w:id="24" w:name="_Toc225366702"/>
       <w:r>
         <w:t>7</w:t>
       </w:r>
       <w:r>
         <w:t>. Lessons Learned &amp; Future Work</w:t>
       </w:r>
-      <w:bookmarkEnd w:id="23"/>
+      <w:bookmarkEnd w:id="24"/>
     </w:p>
     <w:p>
       <w:pPr>
@@ -6164,11 +6197,11 @@
       <w:pPr>
         <w:pStyle w:val="Heading2"/>
       </w:pPr>
-      <w:bookmarkStart w:id="24" w:name="_Toc225263352"/>
+      <w:bookmarkStart w:id="25" w:name="_Toc225366703"/>
       <w:r>
         <w:t>Key Takeaways</w:t>
       </w:r>
-      <w:bookmarkEnd w:id="24"/>
+      <w:bookmarkEnd w:id="25"/>
     </w:p>
     <w:p>
       <w:pPr>
@@ -6401,6 +6434,7 @@
           <w:b/>
           <w:bCs/>
         </w:rPr>
+        <w:lastRenderedPageBreak/>
         <w:t xml:space="preserve">Iteration is mandatory: </w:t>
       </w:r>
       <w:r>
@@ -6424,11 +6458,11 @@
       <w:pPr>
         <w:pStyle w:val="Heading2"/>
       </w:pPr>
-      <w:bookmarkStart w:id="25" w:name="_Toc225263353"/>
+      <w:bookmarkStart w:id="26" w:name="_Toc225366704"/>
       <w:r>
         <w:t>Future Work</w:t>
       </w:r>
-      <w:bookmarkEnd w:id="25"/>
+      <w:bookmarkEnd w:id="26"/>
     </w:p>
     <w:p>
       <w:pPr>
@@ -6567,39 +6601,33 @@
       <w:pPr>
         <w:pStyle w:val="Heading1"/>
       </w:pPr>
-      <w:bookmarkStart w:id="26" w:name="_Toc225263354"/>
+      <w:bookmarkStart w:id="27" w:name="_Toc225366705"/>
       <w:r>
         <w:t>8</w:t>
       </w:r>
       <w:r>
         <w:t>. Conclusion</w:t>
       </w:r>
-      <w:bookmarkEnd w:id="26"/>
-    </w:p>
-    <w:p>
-      <w:pPr>
-        <w:rPr>
-          <w:rFonts w:ascii="Aptos" w:hAnsi="Aptos"/>
-        </w:rPr>
-      </w:pPr>
-    </w:p>
-    <w:p>
-      <w:pPr>
-        <w:rPr>
-          <w:rFonts w:ascii="Aptos" w:hAnsi="Aptos"/>
-        </w:rPr>
-      </w:pPr>
-      <w:r>
-        <w:rPr>
-          <w:rFonts w:ascii="Aptos" w:hAnsi="Aptos"/>
-        </w:rPr>
-        <w:t>M</w:t>
-      </w:r>
-      <w:r>
-        <w:rPr>
-          <w:rFonts w:ascii="Aptos" w:hAnsi="Aptos"/>
-        </w:rPr>
-        <w:t xml:space="preserve">ind-flow </w:t>
+      <w:bookmarkEnd w:id="27"/>
+    </w:p>
+    <w:p>
+      <w:pPr>
+        <w:rPr>
+          <w:rFonts w:ascii="Aptos" w:hAnsi="Aptos"/>
+        </w:rPr>
+      </w:pPr>
+    </w:p>
+    <w:p>
+      <w:pPr>
+        <w:rPr>
+          <w:rFonts w:ascii="Aptos" w:hAnsi="Aptos"/>
+        </w:rPr>
+      </w:pPr>
+      <w:r>
+        <w:rPr>
+          <w:rFonts w:ascii="Aptos" w:hAnsi="Aptos"/>
+        </w:rPr>
+        <w:t xml:space="preserve">Mind-flow </w:t>
       </w:r>
       <w:r>
         <w:rPr>
@@ -10992,6 +11020,18 @@
       <w:ind w:left="480"/>
     </w:pPr>
   </w:style>
+  <w:style w:type="character" w:styleId="UnresolvedMention">
+    <w:name w:val="Unresolved Mention"/>
+    <w:basedOn w:val="DefaultParagraphFont"/>
+    <w:uiPriority w:val="99"/>
+    <w:semiHidden/>
+    <w:unhideWhenUsed/>
+    <w:rsid w:val="0085515B"/>
+    <w:rPr>
+      <w:color w:val="605E5C"/>
+      <w:shd w:val="clear" w:color="auto" w:fill="E1DFDD"/>
+    </w:rPr>
+  </w:style>
 </w:styles>
 </file>
 

</xml_diff>